<commit_message>
correções no gerador de documento do word
</commit_message>
<xml_diff>
--- a/app/compras/templates_docs/CONFERENCIA_PREGAO.docx
+++ b/app/compras/templates_docs/CONFERENCIA_PREGAO.docx
@@ -107,8 +107,8 @@
         <w:tblLook w:val="04a0" w:noHBand="0" w:noVBand="1" w:firstColumn="1" w:lastRow="0" w:lastColumn="0" w:firstRow="1"/>
       </w:tblPr>
       <w:tblGrid>
-        <w:gridCol w:w="757"/>
-        <w:gridCol w:w="293"/>
+        <w:gridCol w:w="755"/>
+        <w:gridCol w:w="295"/>
         <w:gridCol w:w="583"/>
         <w:gridCol w:w="7576"/>
         <w:gridCol w:w="1126"/>
@@ -303,7 +303,7 @@
         <w:trPr/>
         <w:tc>
           <w:tcPr>
-            <w:tcW w:w="757" w:type="dxa"/>
+            <w:tcW w:w="755" w:type="dxa"/>
             <w:vMerge w:val="restart"/>
             <w:tcBorders/>
             <w:textDirection w:val="btLr"/>
@@ -337,7 +337,7 @@
         </w:tc>
         <w:tc>
           <w:tcPr>
-            <w:tcW w:w="8452" w:type="dxa"/>
+            <w:tcW w:w="8454" w:type="dxa"/>
             <w:gridSpan w:val="3"/>
             <w:tcBorders/>
             <w:vAlign w:val="center"/>
@@ -399,7 +399,7 @@
         <w:trPr/>
         <w:tc>
           <w:tcPr>
-            <w:tcW w:w="757" w:type="dxa"/>
+            <w:tcW w:w="755" w:type="dxa"/>
             <w:vMerge w:val="continue"/>
             <w:tcBorders/>
             <w:vAlign w:val="center"/>
@@ -428,7 +428,7 @@
         </w:tc>
         <w:tc>
           <w:tcPr>
-            <w:tcW w:w="8452" w:type="dxa"/>
+            <w:tcW w:w="8454" w:type="dxa"/>
             <w:gridSpan w:val="3"/>
             <w:tcBorders/>
             <w:vAlign w:val="center"/>
@@ -490,7 +490,7 @@
         <w:trPr/>
         <w:tc>
           <w:tcPr>
-            <w:tcW w:w="757" w:type="dxa"/>
+            <w:tcW w:w="755" w:type="dxa"/>
             <w:vMerge w:val="continue"/>
             <w:tcBorders/>
             <w:vAlign w:val="center"/>
@@ -519,7 +519,7 @@
         </w:tc>
         <w:tc>
           <w:tcPr>
-            <w:tcW w:w="8452" w:type="dxa"/>
+            <w:tcW w:w="8454" w:type="dxa"/>
             <w:gridSpan w:val="3"/>
             <w:tcBorders/>
             <w:vAlign w:val="center"/>
@@ -581,7 +581,7 @@
         <w:trPr/>
         <w:tc>
           <w:tcPr>
-            <w:tcW w:w="757" w:type="dxa"/>
+            <w:tcW w:w="755" w:type="dxa"/>
             <w:vMerge w:val="continue"/>
             <w:tcBorders/>
             <w:vAlign w:val="center"/>
@@ -610,7 +610,7 @@
         </w:tc>
         <w:tc>
           <w:tcPr>
-            <w:tcW w:w="8452" w:type="dxa"/>
+            <w:tcW w:w="8454" w:type="dxa"/>
             <w:gridSpan w:val="3"/>
             <w:tcBorders/>
             <w:vAlign w:val="center"/>
@@ -672,7 +672,7 @@
         <w:trPr/>
         <w:tc>
           <w:tcPr>
-            <w:tcW w:w="757" w:type="dxa"/>
+            <w:tcW w:w="755" w:type="dxa"/>
             <w:vMerge w:val="continue"/>
             <w:tcBorders/>
             <w:vAlign w:val="center"/>
@@ -701,7 +701,7 @@
         </w:tc>
         <w:tc>
           <w:tcPr>
-            <w:tcW w:w="8452" w:type="dxa"/>
+            <w:tcW w:w="8454" w:type="dxa"/>
             <w:gridSpan w:val="3"/>
             <w:tcBorders/>
             <w:vAlign w:val="center"/>
@@ -763,7 +763,7 @@
         <w:trPr/>
         <w:tc>
           <w:tcPr>
-            <w:tcW w:w="757" w:type="dxa"/>
+            <w:tcW w:w="755" w:type="dxa"/>
             <w:vMerge w:val="continue"/>
             <w:tcBorders/>
             <w:vAlign w:val="center"/>
@@ -792,7 +792,7 @@
         </w:tc>
         <w:tc>
           <w:tcPr>
-            <w:tcW w:w="8452" w:type="dxa"/>
+            <w:tcW w:w="8454" w:type="dxa"/>
             <w:gridSpan w:val="3"/>
             <w:tcBorders/>
             <w:vAlign w:val="center"/>
@@ -854,7 +854,7 @@
         <w:trPr/>
         <w:tc>
           <w:tcPr>
-            <w:tcW w:w="757" w:type="dxa"/>
+            <w:tcW w:w="755" w:type="dxa"/>
             <w:vMerge w:val="continue"/>
             <w:tcBorders/>
             <w:vAlign w:val="center"/>
@@ -883,7 +883,7 @@
         </w:tc>
         <w:tc>
           <w:tcPr>
-            <w:tcW w:w="8452" w:type="dxa"/>
+            <w:tcW w:w="8454" w:type="dxa"/>
             <w:gridSpan w:val="3"/>
             <w:tcBorders/>
             <w:vAlign w:val="center"/>
@@ -945,7 +945,7 @@
         <w:trPr/>
         <w:tc>
           <w:tcPr>
-            <w:tcW w:w="757" w:type="dxa"/>
+            <w:tcW w:w="755" w:type="dxa"/>
             <w:vMerge w:val="continue"/>
             <w:tcBorders/>
             <w:vAlign w:val="center"/>
@@ -974,7 +974,7 @@
         </w:tc>
         <w:tc>
           <w:tcPr>
-            <w:tcW w:w="8452" w:type="dxa"/>
+            <w:tcW w:w="8454" w:type="dxa"/>
             <w:gridSpan w:val="3"/>
             <w:tcBorders/>
             <w:vAlign w:val="center"/>
@@ -1098,7 +1098,7 @@
         <w:trPr/>
         <w:tc>
           <w:tcPr>
-            <w:tcW w:w="757" w:type="dxa"/>
+            <w:tcW w:w="755" w:type="dxa"/>
             <w:vMerge w:val="restart"/>
             <w:tcBorders/>
             <w:textDirection w:val="btLr"/>
@@ -1132,7 +1132,7 @@
         </w:tc>
         <w:tc>
           <w:tcPr>
-            <w:tcW w:w="8452" w:type="dxa"/>
+            <w:tcW w:w="8454" w:type="dxa"/>
             <w:gridSpan w:val="3"/>
             <w:tcBorders/>
             <w:vAlign w:val="center"/>
@@ -1205,7 +1205,7 @@
         <w:trPr/>
         <w:tc>
           <w:tcPr>
-            <w:tcW w:w="757" w:type="dxa"/>
+            <w:tcW w:w="755" w:type="dxa"/>
             <w:vMerge w:val="continue"/>
             <w:tcBorders/>
             <w:vAlign w:val="center"/>
@@ -1234,7 +1234,7 @@
         </w:tc>
         <w:tc>
           <w:tcPr>
-            <w:tcW w:w="8452" w:type="dxa"/>
+            <w:tcW w:w="8454" w:type="dxa"/>
             <w:gridSpan w:val="3"/>
             <w:tcBorders/>
             <w:vAlign w:val="center"/>
@@ -1296,7 +1296,7 @@
         <w:trPr/>
         <w:tc>
           <w:tcPr>
-            <w:tcW w:w="757" w:type="dxa"/>
+            <w:tcW w:w="755" w:type="dxa"/>
             <w:vMerge w:val="continue"/>
             <w:tcBorders/>
             <w:vAlign w:val="center"/>
@@ -1325,7 +1325,7 @@
         </w:tc>
         <w:tc>
           <w:tcPr>
-            <w:tcW w:w="8452" w:type="dxa"/>
+            <w:tcW w:w="8454" w:type="dxa"/>
             <w:gridSpan w:val="3"/>
             <w:tcBorders/>
             <w:vAlign w:val="center"/>
@@ -1387,7 +1387,7 @@
         <w:trPr/>
         <w:tc>
           <w:tcPr>
-            <w:tcW w:w="757" w:type="dxa"/>
+            <w:tcW w:w="755" w:type="dxa"/>
             <w:vMerge w:val="continue"/>
             <w:tcBorders/>
             <w:vAlign w:val="center"/>
@@ -1416,7 +1416,7 @@
         </w:tc>
         <w:tc>
           <w:tcPr>
-            <w:tcW w:w="8452" w:type="dxa"/>
+            <w:tcW w:w="8454" w:type="dxa"/>
             <w:gridSpan w:val="3"/>
             <w:tcBorders/>
             <w:vAlign w:val="center"/>
@@ -1489,7 +1489,7 @@
         <w:trPr/>
         <w:tc>
           <w:tcPr>
-            <w:tcW w:w="757" w:type="dxa"/>
+            <w:tcW w:w="755" w:type="dxa"/>
             <w:vMerge w:val="continue"/>
             <w:tcBorders/>
             <w:vAlign w:val="center"/>
@@ -1518,7 +1518,7 @@
         </w:tc>
         <w:tc>
           <w:tcPr>
-            <w:tcW w:w="8452" w:type="dxa"/>
+            <w:tcW w:w="8454" w:type="dxa"/>
             <w:gridSpan w:val="3"/>
             <w:tcBorders/>
             <w:vAlign w:val="center"/>
@@ -1580,7 +1580,7 @@
         <w:trPr/>
         <w:tc>
           <w:tcPr>
-            <w:tcW w:w="757" w:type="dxa"/>
+            <w:tcW w:w="755" w:type="dxa"/>
             <w:vMerge w:val="continue"/>
             <w:tcBorders/>
             <w:vAlign w:val="center"/>
@@ -1609,7 +1609,7 @@
         </w:tc>
         <w:tc>
           <w:tcPr>
-            <w:tcW w:w="8452" w:type="dxa"/>
+            <w:tcW w:w="8454" w:type="dxa"/>
             <w:gridSpan w:val="3"/>
             <w:tcBorders/>
             <w:vAlign w:val="center"/>
@@ -1682,7 +1682,7 @@
         <w:trPr/>
         <w:tc>
           <w:tcPr>
-            <w:tcW w:w="757" w:type="dxa"/>
+            <w:tcW w:w="755" w:type="dxa"/>
             <w:vMerge w:val="continue"/>
             <w:tcBorders/>
             <w:vAlign w:val="center"/>
@@ -1711,7 +1711,7 @@
         </w:tc>
         <w:tc>
           <w:tcPr>
-            <w:tcW w:w="8452" w:type="dxa"/>
+            <w:tcW w:w="8454" w:type="dxa"/>
             <w:gridSpan w:val="3"/>
             <w:tcBorders/>
             <w:vAlign w:val="center"/>
@@ -1773,7 +1773,7 @@
         <w:trPr/>
         <w:tc>
           <w:tcPr>
-            <w:tcW w:w="757" w:type="dxa"/>
+            <w:tcW w:w="755" w:type="dxa"/>
             <w:vMerge w:val="continue"/>
             <w:tcBorders/>
             <w:vAlign w:val="center"/>
@@ -1802,7 +1802,7 @@
         </w:tc>
         <w:tc>
           <w:tcPr>
-            <w:tcW w:w="8452" w:type="dxa"/>
+            <w:tcW w:w="8454" w:type="dxa"/>
             <w:gridSpan w:val="3"/>
             <w:tcBorders/>
             <w:vAlign w:val="center"/>
@@ -1875,7 +1875,7 @@
         <w:trPr/>
         <w:tc>
           <w:tcPr>
-            <w:tcW w:w="757" w:type="dxa"/>
+            <w:tcW w:w="755" w:type="dxa"/>
             <w:vMerge w:val="continue"/>
             <w:tcBorders/>
             <w:vAlign w:val="center"/>
@@ -1904,7 +1904,7 @@
         </w:tc>
         <w:tc>
           <w:tcPr>
-            <w:tcW w:w="8452" w:type="dxa"/>
+            <w:tcW w:w="8454" w:type="dxa"/>
             <w:gridSpan w:val="3"/>
             <w:tcBorders/>
             <w:vAlign w:val="center"/>
@@ -1966,7 +1966,7 @@
         <w:trPr/>
         <w:tc>
           <w:tcPr>
-            <w:tcW w:w="757" w:type="dxa"/>
+            <w:tcW w:w="755" w:type="dxa"/>
             <w:vMerge w:val="continue"/>
             <w:tcBorders/>
             <w:vAlign w:val="center"/>
@@ -1995,7 +1995,7 @@
         </w:tc>
         <w:tc>
           <w:tcPr>
-            <w:tcW w:w="8452" w:type="dxa"/>
+            <w:tcW w:w="8454" w:type="dxa"/>
             <w:gridSpan w:val="3"/>
             <w:tcBorders/>
             <w:vAlign w:val="center"/>
@@ -2057,7 +2057,7 @@
         <w:trPr/>
         <w:tc>
           <w:tcPr>
-            <w:tcW w:w="757" w:type="dxa"/>
+            <w:tcW w:w="755" w:type="dxa"/>
             <w:vMerge w:val="continue"/>
             <w:tcBorders/>
             <w:vAlign w:val="center"/>
@@ -2086,7 +2086,7 @@
         </w:tc>
         <w:tc>
           <w:tcPr>
-            <w:tcW w:w="8452" w:type="dxa"/>
+            <w:tcW w:w="8454" w:type="dxa"/>
             <w:gridSpan w:val="3"/>
             <w:tcBorders/>
             <w:vAlign w:val="center"/>
@@ -2148,7 +2148,7 @@
         <w:trPr/>
         <w:tc>
           <w:tcPr>
-            <w:tcW w:w="757" w:type="dxa"/>
+            <w:tcW w:w="755" w:type="dxa"/>
             <w:vMerge w:val="continue"/>
             <w:tcBorders/>
             <w:vAlign w:val="center"/>
@@ -2177,7 +2177,7 @@
         </w:tc>
         <w:tc>
           <w:tcPr>
-            <w:tcW w:w="8452" w:type="dxa"/>
+            <w:tcW w:w="8454" w:type="dxa"/>
             <w:gridSpan w:val="3"/>
             <w:tcBorders/>
             <w:vAlign w:val="center"/>
@@ -2239,7 +2239,7 @@
         <w:trPr/>
         <w:tc>
           <w:tcPr>
-            <w:tcW w:w="757" w:type="dxa"/>
+            <w:tcW w:w="755" w:type="dxa"/>
             <w:vMerge w:val="continue"/>
             <w:tcBorders/>
             <w:vAlign w:val="center"/>
@@ -2268,7 +2268,7 @@
         </w:tc>
         <w:tc>
           <w:tcPr>
-            <w:tcW w:w="8452" w:type="dxa"/>
+            <w:tcW w:w="8454" w:type="dxa"/>
             <w:gridSpan w:val="3"/>
             <w:tcBorders/>
             <w:vAlign w:val="center"/>
@@ -2465,7 +2465,7 @@
         <w:trPr/>
         <w:tc>
           <w:tcPr>
-            <w:tcW w:w="757" w:type="dxa"/>
+            <w:tcW w:w="755" w:type="dxa"/>
             <w:vMerge w:val="restart"/>
             <w:tcBorders/>
             <w:textDirection w:val="btLr"/>
@@ -2499,7 +2499,7 @@
         </w:tc>
         <w:tc>
           <w:tcPr>
-            <w:tcW w:w="8452" w:type="dxa"/>
+            <w:tcW w:w="8454" w:type="dxa"/>
             <w:gridSpan w:val="3"/>
             <w:tcBorders/>
             <w:vAlign w:val="center"/>
@@ -2567,7 +2567,7 @@
         <w:trPr/>
         <w:tc>
           <w:tcPr>
-            <w:tcW w:w="757" w:type="dxa"/>
+            <w:tcW w:w="755" w:type="dxa"/>
             <w:vMerge w:val="continue"/>
             <w:tcBorders/>
             <w:vAlign w:val="center"/>
@@ -2596,7 +2596,7 @@
         </w:tc>
         <w:tc>
           <w:tcPr>
-            <w:tcW w:w="8452" w:type="dxa"/>
+            <w:tcW w:w="8454" w:type="dxa"/>
             <w:gridSpan w:val="3"/>
             <w:tcBorders/>
             <w:vAlign w:val="center"/>
@@ -2664,7 +2664,7 @@
         <w:trPr/>
         <w:tc>
           <w:tcPr>
-            <w:tcW w:w="757" w:type="dxa"/>
+            <w:tcW w:w="755" w:type="dxa"/>
             <w:vMerge w:val="continue"/>
             <w:tcBorders/>
             <w:vAlign w:val="center"/>
@@ -2693,7 +2693,7 @@
         </w:tc>
         <w:tc>
           <w:tcPr>
-            <w:tcW w:w="8452" w:type="dxa"/>
+            <w:tcW w:w="8454" w:type="dxa"/>
             <w:gridSpan w:val="3"/>
             <w:tcBorders/>
             <w:vAlign w:val="center"/>
@@ -2761,7 +2761,7 @@
         <w:trPr/>
         <w:tc>
           <w:tcPr>
-            <w:tcW w:w="757" w:type="dxa"/>
+            <w:tcW w:w="755" w:type="dxa"/>
             <w:vMerge w:val="continue"/>
             <w:tcBorders/>
             <w:vAlign w:val="center"/>
@@ -2790,7 +2790,7 @@
         </w:tc>
         <w:tc>
           <w:tcPr>
-            <w:tcW w:w="8452" w:type="dxa"/>
+            <w:tcW w:w="8454" w:type="dxa"/>
             <w:gridSpan w:val="3"/>
             <w:tcBorders/>
             <w:vAlign w:val="center"/>
@@ -2858,7 +2858,7 @@
         <w:trPr/>
         <w:tc>
           <w:tcPr>
-            <w:tcW w:w="757" w:type="dxa"/>
+            <w:tcW w:w="755" w:type="dxa"/>
             <w:vMerge w:val="continue"/>
             <w:tcBorders/>
             <w:vAlign w:val="center"/>
@@ -2887,7 +2887,7 @@
         </w:tc>
         <w:tc>
           <w:tcPr>
-            <w:tcW w:w="8452" w:type="dxa"/>
+            <w:tcW w:w="8454" w:type="dxa"/>
             <w:gridSpan w:val="3"/>
             <w:tcBorders/>
             <w:vAlign w:val="center"/>
@@ -2955,7 +2955,7 @@
         <w:trPr/>
         <w:tc>
           <w:tcPr>
-            <w:tcW w:w="757" w:type="dxa"/>
+            <w:tcW w:w="755" w:type="dxa"/>
             <w:vMerge w:val="continue"/>
             <w:tcBorders/>
             <w:vAlign w:val="center"/>
@@ -2984,7 +2984,7 @@
         </w:tc>
         <w:tc>
           <w:tcPr>
-            <w:tcW w:w="8452" w:type="dxa"/>
+            <w:tcW w:w="8454" w:type="dxa"/>
             <w:gridSpan w:val="3"/>
             <w:tcBorders/>
             <w:vAlign w:val="center"/>
@@ -3052,7 +3052,7 @@
         <w:trPr/>
         <w:tc>
           <w:tcPr>
-            <w:tcW w:w="757" w:type="dxa"/>
+            <w:tcW w:w="755" w:type="dxa"/>
             <w:vMerge w:val="continue"/>
             <w:tcBorders/>
             <w:vAlign w:val="center"/>
@@ -3081,7 +3081,7 @@
         </w:tc>
         <w:tc>
           <w:tcPr>
-            <w:tcW w:w="8452" w:type="dxa"/>
+            <w:tcW w:w="8454" w:type="dxa"/>
             <w:gridSpan w:val="3"/>
             <w:tcBorders/>
             <w:vAlign w:val="center"/>
@@ -3149,7 +3149,7 @@
         <w:trPr/>
         <w:tc>
           <w:tcPr>
-            <w:tcW w:w="757" w:type="dxa"/>
+            <w:tcW w:w="755" w:type="dxa"/>
             <w:vMerge w:val="continue"/>
             <w:tcBorders/>
             <w:vAlign w:val="center"/>
@@ -3178,7 +3178,7 @@
         </w:tc>
         <w:tc>
           <w:tcPr>
-            <w:tcW w:w="8452" w:type="dxa"/>
+            <w:tcW w:w="8454" w:type="dxa"/>
             <w:gridSpan w:val="3"/>
             <w:tcBorders/>
             <w:vAlign w:val="center"/>
@@ -3246,7 +3246,7 @@
         <w:trPr/>
         <w:tc>
           <w:tcPr>
-            <w:tcW w:w="757" w:type="dxa"/>
+            <w:tcW w:w="755" w:type="dxa"/>
             <w:vMerge w:val="continue"/>
             <w:tcBorders/>
             <w:vAlign w:val="center"/>
@@ -3275,7 +3275,7 @@
         </w:tc>
         <w:tc>
           <w:tcPr>
-            <w:tcW w:w="8452" w:type="dxa"/>
+            <w:tcW w:w="8454" w:type="dxa"/>
             <w:gridSpan w:val="3"/>
             <w:tcBorders/>
             <w:vAlign w:val="center"/>
@@ -3343,7 +3343,7 @@
         <w:trPr/>
         <w:tc>
           <w:tcPr>
-            <w:tcW w:w="757" w:type="dxa"/>
+            <w:tcW w:w="755" w:type="dxa"/>
             <w:vMerge w:val="continue"/>
             <w:tcBorders/>
             <w:vAlign w:val="center"/>
@@ -3372,7 +3372,7 @@
         </w:tc>
         <w:tc>
           <w:tcPr>
-            <w:tcW w:w="8452" w:type="dxa"/>
+            <w:tcW w:w="8454" w:type="dxa"/>
             <w:gridSpan w:val="3"/>
             <w:tcBorders/>
             <w:vAlign w:val="center"/>
@@ -3440,7 +3440,7 @@
         <w:trPr/>
         <w:tc>
           <w:tcPr>
-            <w:tcW w:w="757" w:type="dxa"/>
+            <w:tcW w:w="755" w:type="dxa"/>
             <w:vMerge w:val="continue"/>
             <w:tcBorders/>
             <w:vAlign w:val="center"/>
@@ -3469,7 +3469,7 @@
         </w:tc>
         <w:tc>
           <w:tcPr>
-            <w:tcW w:w="8452" w:type="dxa"/>
+            <w:tcW w:w="8454" w:type="dxa"/>
             <w:gridSpan w:val="3"/>
             <w:tcBorders/>
             <w:vAlign w:val="center"/>
@@ -4862,7 +4862,7 @@
         </w:trPr>
         <w:tc>
           <w:tcPr>
-            <w:tcW w:w="757" w:type="dxa"/>
+            <w:tcW w:w="755" w:type="dxa"/>
             <w:vMerge w:val="restart"/>
             <w:tcBorders/>
             <w:textDirection w:val="btLr"/>
@@ -4896,7 +4896,7 @@
         </w:tc>
         <w:tc>
           <w:tcPr>
-            <w:tcW w:w="8452" w:type="dxa"/>
+            <w:tcW w:w="8454" w:type="dxa"/>
             <w:gridSpan w:val="3"/>
             <w:tcBorders/>
             <w:vAlign w:val="center"/>
@@ -4961,7 +4961,7 @@
         </w:trPr>
         <w:tc>
           <w:tcPr>
-            <w:tcW w:w="757" w:type="dxa"/>
+            <w:tcW w:w="755" w:type="dxa"/>
             <w:vMerge w:val="continue"/>
             <w:tcBorders/>
             <w:textDirection w:val="btLr"/>
@@ -4992,7 +4992,7 @@
         </w:tc>
         <w:tc>
           <w:tcPr>
-            <w:tcW w:w="8452" w:type="dxa"/>
+            <w:tcW w:w="8454" w:type="dxa"/>
             <w:gridSpan w:val="3"/>
             <w:tcBorders/>
             <w:vAlign w:val="center"/>
@@ -5057,7 +5057,7 @@
         </w:trPr>
         <w:tc>
           <w:tcPr>
-            <w:tcW w:w="757" w:type="dxa"/>
+            <w:tcW w:w="755" w:type="dxa"/>
             <w:vMerge w:val="continue"/>
             <w:tcBorders/>
             <w:textDirection w:val="btLr"/>
@@ -5088,7 +5088,7 @@
         </w:tc>
         <w:tc>
           <w:tcPr>
-            <w:tcW w:w="8452" w:type="dxa"/>
+            <w:tcW w:w="8454" w:type="dxa"/>
             <w:gridSpan w:val="3"/>
             <w:tcBorders/>
             <w:vAlign w:val="center"/>
@@ -5153,7 +5153,7 @@
         </w:trPr>
         <w:tc>
           <w:tcPr>
-            <w:tcW w:w="757" w:type="dxa"/>
+            <w:tcW w:w="755" w:type="dxa"/>
             <w:vMerge w:val="continue"/>
             <w:tcBorders/>
             <w:textDirection w:val="btLr"/>
@@ -5184,7 +5184,7 @@
         </w:tc>
         <w:tc>
           <w:tcPr>
-            <w:tcW w:w="8452" w:type="dxa"/>
+            <w:tcW w:w="8454" w:type="dxa"/>
             <w:gridSpan w:val="3"/>
             <w:tcBorders/>
             <w:vAlign w:val="center"/>
@@ -5311,7 +5311,7 @@
         </w:trPr>
         <w:tc>
           <w:tcPr>
-            <w:tcW w:w="757" w:type="dxa"/>
+            <w:tcW w:w="755" w:type="dxa"/>
             <w:vMerge w:val="restart"/>
             <w:tcBorders/>
             <w:textDirection w:val="btLr"/>
@@ -5345,7 +5345,7 @@
         </w:tc>
         <w:tc>
           <w:tcPr>
-            <w:tcW w:w="8452" w:type="dxa"/>
+            <w:tcW w:w="8454" w:type="dxa"/>
             <w:gridSpan w:val="3"/>
             <w:tcBorders/>
             <w:vAlign w:val="center"/>
@@ -5410,7 +5410,7 @@
         </w:trPr>
         <w:tc>
           <w:tcPr>
-            <w:tcW w:w="757" w:type="dxa"/>
+            <w:tcW w:w="755" w:type="dxa"/>
             <w:vMerge w:val="continue"/>
             <w:tcBorders/>
             <w:textDirection w:val="btLr"/>
@@ -5441,7 +5441,7 @@
         </w:tc>
         <w:tc>
           <w:tcPr>
-            <w:tcW w:w="8452" w:type="dxa"/>
+            <w:tcW w:w="8454" w:type="dxa"/>
             <w:gridSpan w:val="3"/>
             <w:tcBorders/>
             <w:vAlign w:val="center"/>
@@ -5506,7 +5506,7 @@
         </w:trPr>
         <w:tc>
           <w:tcPr>
-            <w:tcW w:w="757" w:type="dxa"/>
+            <w:tcW w:w="755" w:type="dxa"/>
             <w:vMerge w:val="continue"/>
             <w:tcBorders/>
             <w:textDirection w:val="btLr"/>
@@ -5537,7 +5537,7 @@
         </w:tc>
         <w:tc>
           <w:tcPr>
-            <w:tcW w:w="8452" w:type="dxa"/>
+            <w:tcW w:w="8454" w:type="dxa"/>
             <w:gridSpan w:val="3"/>
             <w:tcBorders/>
             <w:vAlign w:val="center"/>
@@ -5882,7 +5882,7 @@
         <w:trPr/>
         <w:tc>
           <w:tcPr>
-            <w:tcW w:w="757" w:type="dxa"/>
+            <w:tcW w:w="755" w:type="dxa"/>
             <w:vMerge w:val="restart"/>
             <w:tcBorders/>
             <w:textDirection w:val="btLr"/>
@@ -5916,7 +5916,7 @@
         </w:tc>
         <w:tc>
           <w:tcPr>
-            <w:tcW w:w="8452" w:type="dxa"/>
+            <w:tcW w:w="8454" w:type="dxa"/>
             <w:gridSpan w:val="3"/>
             <w:tcBorders/>
             <w:vAlign w:val="center"/>
@@ -5978,7 +5978,7 @@
         <w:trPr/>
         <w:tc>
           <w:tcPr>
-            <w:tcW w:w="757" w:type="dxa"/>
+            <w:tcW w:w="755" w:type="dxa"/>
             <w:vMerge w:val="continue"/>
             <w:tcBorders/>
             <w:vAlign w:val="center"/>
@@ -6009,7 +6009,7 @@
         </w:tc>
         <w:tc>
           <w:tcPr>
-            <w:tcW w:w="8452" w:type="dxa"/>
+            <w:tcW w:w="8454" w:type="dxa"/>
             <w:gridSpan w:val="3"/>
             <w:tcBorders/>
             <w:vAlign w:val="center"/>
@@ -6071,7 +6071,7 @@
         <w:trPr/>
         <w:tc>
           <w:tcPr>
-            <w:tcW w:w="757" w:type="dxa"/>
+            <w:tcW w:w="755" w:type="dxa"/>
             <w:vMerge w:val="continue"/>
             <w:tcBorders/>
             <w:vAlign w:val="center"/>
@@ -6102,7 +6102,7 @@
         </w:tc>
         <w:tc>
           <w:tcPr>
-            <w:tcW w:w="8452" w:type="dxa"/>
+            <w:tcW w:w="8454" w:type="dxa"/>
             <w:gridSpan w:val="3"/>
             <w:tcBorders/>
             <w:vAlign w:val="center"/>
@@ -6164,7 +6164,7 @@
         <w:trPr/>
         <w:tc>
           <w:tcPr>
-            <w:tcW w:w="757" w:type="dxa"/>
+            <w:tcW w:w="755" w:type="dxa"/>
             <w:vMerge w:val="continue"/>
             <w:tcBorders/>
             <w:vAlign w:val="center"/>
@@ -6195,7 +6195,7 @@
         </w:tc>
         <w:tc>
           <w:tcPr>
-            <w:tcW w:w="8452" w:type="dxa"/>
+            <w:tcW w:w="8454" w:type="dxa"/>
             <w:gridSpan w:val="3"/>
             <w:tcBorders/>
             <w:vAlign w:val="center"/>
@@ -13986,10 +13986,878 @@
         <w:br/>
       </w:r>
     </w:p>
+    <w:tbl>
+      <w:tblPr>
+        <w:tblW w:w="11070" w:type="dxa"/>
+        <w:jc w:val="left"/>
+        <w:tblInd w:w="100" w:type="dxa"/>
+        <w:tblLayout w:type="fixed"/>
+        <w:tblCellMar>
+          <w:top w:w="100" w:type="dxa"/>
+          <w:left w:w="100" w:type="dxa"/>
+          <w:bottom w:w="100" w:type="dxa"/>
+          <w:right w:w="100" w:type="dxa"/>
+        </w:tblCellMar>
+        <w:tblLook w:val="04a0" w:noHBand="0" w:noVBand="1" w:firstColumn="1" w:lastRow="0" w:lastColumn="0" w:firstRow="1"/>
+      </w:tblPr>
+      <w:tblGrid>
+        <w:gridCol w:w="1350"/>
+        <w:gridCol w:w="1058"/>
+        <w:gridCol w:w="652"/>
+        <w:gridCol w:w="666"/>
+        <w:gridCol w:w="1316"/>
+        <w:gridCol w:w="3254"/>
+        <w:gridCol w:w="1972"/>
+        <w:gridCol w:w="560"/>
+        <w:gridCol w:w="240"/>
+      </w:tblGrid>
+      <w:tr>
+        <w:trPr/>
+        <w:tc>
+          <w:tcPr>
+            <w:tcW w:w="1350" w:type="dxa"/>
+            <w:tcBorders>
+              <w:top w:val="single" w:sz="8" w:space="0" w:color="000000"/>
+              <w:left w:val="single" w:sz="8" w:space="0" w:color="000000"/>
+              <w:bottom w:val="single" w:sz="8" w:space="0" w:color="000000"/>
+              <w:right w:val="single" w:sz="8" w:space="0" w:color="000000"/>
+            </w:tcBorders>
+            <w:vAlign w:val="center"/>
+          </w:tcPr>
+          <w:p>
+            <w:pPr>
+              <w:pStyle w:val="Contedodatabela"/>
+              <w:widowControl/>
+              <w:spacing w:lineRule="auto" w:line="288" w:before="0" w:after="0"/>
+              <w:rPr>
+                <w:sz w:val="16"/>
+                <w:szCs w:val="16"/>
+              </w:rPr>
+            </w:pPr>
+            <w:r>
+              <w:rPr>
+                <w:rFonts w:cs="CenturyGothic,Bold"/>
+                <w:b/>
+                <w:bCs/>
+                <w:color w:val="000000"/>
+                <w:sz w:val="16"/>
+                <w:szCs w:val="16"/>
+              </w:rPr>
+              <w:t>Demanda</w:t>
+            </w:r>
+          </w:p>
+        </w:tc>
+        <w:tc>
+          <w:tcPr>
+            <w:tcW w:w="1058" w:type="dxa"/>
+            <w:tcBorders>
+              <w:top w:val="single" w:sz="8" w:space="0" w:color="000000"/>
+              <w:left w:val="single" w:sz="8" w:space="0" w:color="000000"/>
+              <w:bottom w:val="single" w:sz="8" w:space="0" w:color="000000"/>
+              <w:right w:val="single" w:sz="8" w:space="0" w:color="000000"/>
+            </w:tcBorders>
+            <w:vAlign w:val="center"/>
+          </w:tcPr>
+          <w:p>
+            <w:pPr>
+              <w:pStyle w:val="Contedodatabela"/>
+              <w:widowControl/>
+              <w:spacing w:lineRule="auto" w:line="288" w:before="0" w:after="0"/>
+              <w:rPr>
+                <w:sz w:val="16"/>
+                <w:szCs w:val="16"/>
+              </w:rPr>
+            </w:pPr>
+            <w:r>
+              <w:rPr>
+                <w:rFonts w:cs="CenturyGothic,Bold"/>
+                <w:b/>
+                <w:bCs/>
+                <w:color w:val="000000"/>
+                <w:sz w:val="16"/>
+                <w:szCs w:val="16"/>
+              </w:rPr>
+              <w:t>Centro de despesa</w:t>
+              <w:br/>
+              <w:t>Grupo Orçamentário</w:t>
+            </w:r>
+          </w:p>
+        </w:tc>
+        <w:tc>
+          <w:tcPr>
+            <w:tcW w:w="652" w:type="dxa"/>
+            <w:tcBorders>
+              <w:top w:val="single" w:sz="8" w:space="0" w:color="000000"/>
+              <w:left w:val="single" w:sz="8" w:space="0" w:color="000000"/>
+              <w:bottom w:val="single" w:sz="8" w:space="0" w:color="000000"/>
+              <w:right w:val="single" w:sz="8" w:space="0" w:color="000000"/>
+            </w:tcBorders>
+            <w:vAlign w:val="center"/>
+          </w:tcPr>
+          <w:p>
+            <w:pPr>
+              <w:pStyle w:val="Contedodatabela"/>
+              <w:widowControl/>
+              <w:spacing w:lineRule="auto" w:line="288" w:before="0" w:after="0"/>
+              <w:jc w:val="center"/>
+              <w:rPr>
+                <w:sz w:val="16"/>
+                <w:szCs w:val="16"/>
+              </w:rPr>
+            </w:pPr>
+            <w:r>
+              <w:rPr>
+                <w:rFonts w:cs="CenturyGothic,Bold"/>
+                <w:b/>
+                <w:bCs/>
+                <w:color w:val="000000"/>
+                <w:sz w:val="16"/>
+                <w:szCs w:val="16"/>
+              </w:rPr>
+              <w:t>Item</w:t>
+            </w:r>
+          </w:p>
+        </w:tc>
+        <w:tc>
+          <w:tcPr>
+            <w:tcW w:w="666" w:type="dxa"/>
+            <w:tcBorders>
+              <w:top w:val="single" w:sz="8" w:space="0" w:color="000000"/>
+              <w:left w:val="single" w:sz="8" w:space="0" w:color="000000"/>
+              <w:bottom w:val="single" w:sz="8" w:space="0" w:color="000000"/>
+              <w:right w:val="single" w:sz="8" w:space="0" w:color="000000"/>
+            </w:tcBorders>
+            <w:vAlign w:val="center"/>
+          </w:tcPr>
+          <w:p>
+            <w:pPr>
+              <w:pStyle w:val="Contedodatabela"/>
+              <w:widowControl/>
+              <w:spacing w:lineRule="auto" w:line="288" w:before="0" w:after="0"/>
+              <w:jc w:val="center"/>
+              <w:rPr>
+                <w:sz w:val="16"/>
+                <w:szCs w:val="16"/>
+              </w:rPr>
+            </w:pPr>
+            <w:r>
+              <w:rPr>
+                <w:rFonts w:cs="CenturyGothic,Bold"/>
+                <w:b/>
+                <w:bCs/>
+                <w:color w:val="000000"/>
+                <w:sz w:val="16"/>
+                <w:szCs w:val="16"/>
+              </w:rPr>
+              <w:t>Qtde</w:t>
+            </w:r>
+          </w:p>
+        </w:tc>
+        <w:tc>
+          <w:tcPr>
+            <w:tcW w:w="1316" w:type="dxa"/>
+            <w:tcBorders>
+              <w:top w:val="single" w:sz="8" w:space="0" w:color="000000"/>
+              <w:left w:val="single" w:sz="8" w:space="0" w:color="000000"/>
+              <w:bottom w:val="single" w:sz="8" w:space="0" w:color="000000"/>
+              <w:right w:val="single" w:sz="8" w:space="0" w:color="000000"/>
+            </w:tcBorders>
+            <w:vAlign w:val="center"/>
+          </w:tcPr>
+          <w:p>
+            <w:pPr>
+              <w:pStyle w:val="Contedodatabela"/>
+              <w:widowControl/>
+              <w:spacing w:lineRule="auto" w:line="288" w:before="0" w:after="0"/>
+              <w:jc w:val="center"/>
+              <w:rPr>
+                <w:sz w:val="16"/>
+                <w:szCs w:val="16"/>
+              </w:rPr>
+            </w:pPr>
+            <w:r>
+              <w:rPr>
+                <w:rFonts w:cs="CenturyGothic,Bold"/>
+                <w:b/>
+                <w:bCs/>
+                <w:color w:val="000000"/>
+                <w:sz w:val="16"/>
+                <w:szCs w:val="16"/>
+              </w:rPr>
+              <w:t>Código Compras GOV</w:t>
+            </w:r>
+          </w:p>
+        </w:tc>
+        <w:tc>
+          <w:tcPr>
+            <w:tcW w:w="3254" w:type="dxa"/>
+            <w:tcBorders>
+              <w:top w:val="single" w:sz="8" w:space="0" w:color="000000"/>
+              <w:left w:val="single" w:sz="8" w:space="0" w:color="000000"/>
+              <w:bottom w:val="single" w:sz="8" w:space="0" w:color="000000"/>
+              <w:right w:val="single" w:sz="8" w:space="0" w:color="000000"/>
+            </w:tcBorders>
+            <w:vAlign w:val="center"/>
+          </w:tcPr>
+          <w:p>
+            <w:pPr>
+              <w:pStyle w:val="Contedodatabela"/>
+              <w:widowControl/>
+              <w:spacing w:lineRule="auto" w:line="288" w:before="0" w:after="0"/>
+              <w:rPr>
+                <w:sz w:val="16"/>
+                <w:szCs w:val="16"/>
+              </w:rPr>
+            </w:pPr>
+            <w:r>
+              <w:rPr>
+                <w:rFonts w:cs="CenturyGothic,Bold"/>
+                <w:b/>
+                <w:bCs/>
+                <w:color w:val="000000"/>
+                <w:sz w:val="16"/>
+                <w:szCs w:val="16"/>
+              </w:rPr>
+              <w:t>Descrição</w:t>
+            </w:r>
+          </w:p>
+        </w:tc>
+        <w:tc>
+          <w:tcPr>
+            <w:tcW w:w="1972" w:type="dxa"/>
+            <w:tcBorders>
+              <w:top w:val="single" w:sz="8" w:space="0" w:color="000000"/>
+              <w:left w:val="single" w:sz="8" w:space="0" w:color="000000"/>
+              <w:bottom w:val="single" w:sz="8" w:space="0" w:color="000000"/>
+              <w:right w:val="single" w:sz="8" w:space="0" w:color="000000"/>
+            </w:tcBorders>
+            <w:vAlign w:val="center"/>
+          </w:tcPr>
+          <w:p>
+            <w:pPr>
+              <w:pStyle w:val="Contedodatabela"/>
+              <w:widowControl/>
+              <w:spacing w:lineRule="auto" w:line="288" w:before="0" w:after="0"/>
+              <w:rPr>
+                <w:sz w:val="16"/>
+                <w:szCs w:val="16"/>
+              </w:rPr>
+            </w:pPr>
+            <w:r>
+              <w:rPr>
+                <w:rFonts w:cs="CenturyGothic,Bold"/>
+                <w:b/>
+                <w:bCs/>
+                <w:color w:val="000000"/>
+                <w:sz w:val="16"/>
+                <w:szCs w:val="16"/>
+              </w:rPr>
+              <w:t>Item de despesa</w:t>
+            </w:r>
+          </w:p>
+        </w:tc>
+        <w:tc>
+          <w:tcPr>
+            <w:tcW w:w="560" w:type="dxa"/>
+            <w:tcBorders>
+              <w:top w:val="single" w:sz="8" w:space="0" w:color="000000"/>
+              <w:left w:val="single" w:sz="8" w:space="0" w:color="000000"/>
+              <w:bottom w:val="single" w:sz="8" w:space="0" w:color="000000"/>
+              <w:right w:val="single" w:sz="8" w:space="0" w:color="000000"/>
+            </w:tcBorders>
+            <w:vAlign w:val="center"/>
+          </w:tcPr>
+          <w:p>
+            <w:pPr>
+              <w:pStyle w:val="Contedodatabela"/>
+              <w:widowControl/>
+              <w:spacing w:lineRule="auto" w:line="288" w:before="0" w:after="0"/>
+              <w:rPr>
+                <w:sz w:val="16"/>
+                <w:szCs w:val="16"/>
+              </w:rPr>
+            </w:pPr>
+            <w:r>
+              <w:rPr>
+                <w:rFonts w:cs="CenturyGothic,Bold"/>
+                <w:b/>
+                <w:bCs/>
+                <w:color w:val="000000"/>
+                <w:sz w:val="16"/>
+                <w:szCs w:val="16"/>
+              </w:rPr>
+              <w:t>TRP</w:t>
+            </w:r>
+          </w:p>
+        </w:tc>
+        <w:tc>
+          <w:tcPr>
+            <w:tcW w:w="240" w:type="dxa"/>
+            <w:tcBorders>
+              <w:top w:val="single" w:sz="8" w:space="0" w:color="000000"/>
+              <w:left w:val="single" w:sz="8" w:space="0" w:color="000000"/>
+              <w:bottom w:val="single" w:sz="8" w:space="0" w:color="000000"/>
+              <w:right w:val="single" w:sz="8" w:space="0" w:color="000000"/>
+            </w:tcBorders>
+            <w:vAlign w:val="center"/>
+          </w:tcPr>
+          <w:p>
+            <w:pPr>
+              <w:pStyle w:val="Contedodatabela"/>
+              <w:widowControl/>
+              <w:spacing w:lineRule="auto" w:line="288" w:before="0" w:after="0"/>
+              <w:rPr>
+                <w:sz w:val="16"/>
+                <w:szCs w:val="16"/>
+              </w:rPr>
+            </w:pPr>
+            <w:r>
+              <w:rPr>
+                <w:rFonts w:cs="CenturyGothic,Bold"/>
+                <w:b/>
+                <w:bCs/>
+                <w:color w:val="000000"/>
+                <w:sz w:val="16"/>
+                <w:szCs w:val="16"/>
+              </w:rPr>
+              <w:t>TR</w:t>
+            </w:r>
+          </w:p>
+        </w:tc>
+      </w:tr>
+      <w:tr>
+        <w:trPr>
+          <w:trHeight w:val="387" w:hRule="atLeast"/>
+        </w:trPr>
+        <w:tc>
+          <w:tcPr>
+            <w:tcW w:w="11068" w:type="dxa"/>
+            <w:gridSpan w:val="9"/>
+            <w:tcBorders>
+              <w:top w:val="single" w:sz="8" w:space="0" w:color="000000"/>
+              <w:left w:val="single" w:sz="8" w:space="0" w:color="000000"/>
+              <w:bottom w:val="single" w:sz="8" w:space="0" w:color="000000"/>
+              <w:right w:val="single" w:sz="8" w:space="0" w:color="000000"/>
+            </w:tcBorders>
+            <w:vAlign w:val="center"/>
+          </w:tcPr>
+          <w:p>
+            <w:pPr>
+              <w:pStyle w:val="TableContents"/>
+              <w:spacing w:before="0" w:after="200"/>
+              <w:rPr>
+                <w:rFonts w:ascii="Arial" w:hAnsi="Arial"/>
+              </w:rPr>
+            </w:pPr>
+            <w:r>
+              <w:rPr>
+                <w:color w:val="2A6099"/>
+                <w:sz w:val="12"/>
+                <w:szCs w:val="12"/>
+              </w:rPr>
+              <w:t>{%tr for item in itens %}</w:t>
+            </w:r>
+          </w:p>
+        </w:tc>
+      </w:tr>
+      <w:tr>
+        <w:trPr/>
+        <w:tc>
+          <w:tcPr>
+            <w:tcW w:w="1350" w:type="dxa"/>
+            <w:tcBorders>
+              <w:left w:val="single" w:sz="8" w:space="0" w:color="000000"/>
+              <w:bottom w:val="single" w:sz="8" w:space="0" w:color="000000"/>
+              <w:right w:val="single" w:sz="8" w:space="0" w:color="000000"/>
+            </w:tcBorders>
+            <w:vAlign w:val="center"/>
+          </w:tcPr>
+          <w:p>
+            <w:pPr>
+              <w:pStyle w:val="Contedodatabela"/>
+              <w:widowControl/>
+              <w:spacing w:lineRule="auto" w:line="288" w:before="0" w:after="0"/>
+              <w:rPr>
+                <w:rFonts w:ascii="Arial" w:hAnsi="Arial"/>
+                <w:sz w:val="16"/>
+                <w:szCs w:val="16"/>
+              </w:rPr>
+            </w:pPr>
+            <w:r>
+              <w:rPr>
+                <w:rFonts w:cs="CenturyGothic,Bold"/>
+                <w:bCs/>
+                <w:color w:val="FF0000"/>
+                <w:sz w:val="16"/>
+                <w:szCs w:val="16"/>
+              </w:rPr>
+              <w:t xml:space="preserve">{{ </w:t>
+            </w:r>
+            <w:r>
+              <w:rPr>
+                <w:rFonts w:cs="CenturyGothic,Bold"/>
+                <w:bCs/>
+                <w:color w:val="FF0000"/>
+                <w:sz w:val="16"/>
+                <w:szCs w:val="16"/>
+              </w:rPr>
+              <w:t>item.</w:t>
+            </w:r>
+            <w:r>
+              <w:rPr>
+                <w:rFonts w:cs="CenturyGothic,Bold"/>
+                <w:bCs/>
+                <w:color w:val="FF0000"/>
+                <w:sz w:val="16"/>
+                <w:szCs w:val="16"/>
+              </w:rPr>
+              <w:t>numero_demanda }}</w:t>
+            </w:r>
+          </w:p>
+        </w:tc>
+        <w:tc>
+          <w:tcPr>
+            <w:tcW w:w="1058" w:type="dxa"/>
+            <w:tcBorders>
+              <w:left w:val="single" w:sz="8" w:space="0" w:color="000000"/>
+              <w:bottom w:val="single" w:sz="8" w:space="0" w:color="000000"/>
+              <w:right w:val="single" w:sz="8" w:space="0" w:color="000000"/>
+            </w:tcBorders>
+            <w:vAlign w:val="center"/>
+          </w:tcPr>
+          <w:p>
+            <w:pPr>
+              <w:pStyle w:val="Contedodatabela"/>
+              <w:widowControl/>
+              <w:spacing w:lineRule="auto" w:line="288" w:before="0" w:after="0"/>
+              <w:rPr>
+                <w:rFonts w:ascii="Arial" w:hAnsi="Arial"/>
+              </w:rPr>
+            </w:pPr>
+            <w:r>
+              <w:rPr>
+                <w:rFonts w:cs="CenturyGothic,Bold"/>
+                <w:bCs/>
+                <w:color w:val="FF0000"/>
+                <w:sz w:val="16"/>
+                <w:szCs w:val="16"/>
+              </w:rPr>
+              <w:t xml:space="preserve">{{ </w:t>
+            </w:r>
+            <w:r>
+              <w:rPr>
+                <w:rFonts w:cs="CenturyGothic,Bold"/>
+                <w:bCs/>
+                <w:color w:val="FF0000"/>
+                <w:sz w:val="16"/>
+                <w:szCs w:val="16"/>
+              </w:rPr>
+              <w:t>item.</w:t>
+            </w:r>
+            <w:r>
+              <w:rPr>
+                <w:rFonts w:cs="CenturyGothic,Bold"/>
+                <w:bCs/>
+                <w:color w:val="FF0000"/>
+                <w:sz w:val="16"/>
+                <w:szCs w:val="16"/>
+              </w:rPr>
+              <w:t>centro_despesa }}</w:t>
+              <w:br/>
+              <w:t xml:space="preserve">{{ </w:t>
+            </w:r>
+            <w:r>
+              <w:rPr>
+                <w:rFonts w:cs="CenturyGothic,Bold"/>
+                <w:bCs/>
+                <w:color w:val="FF0000"/>
+                <w:sz w:val="16"/>
+                <w:szCs w:val="16"/>
+              </w:rPr>
+              <w:t>item.</w:t>
+            </w:r>
+            <w:r>
+              <w:rPr>
+                <w:rFonts w:cs="CenturyGothic,Bold"/>
+                <w:bCs/>
+                <w:color w:val="FF0000"/>
+                <w:sz w:val="16"/>
+                <w:szCs w:val="16"/>
+              </w:rPr>
+              <w:t>grupo_orcamentario }}</w:t>
+            </w:r>
+          </w:p>
+        </w:tc>
+        <w:tc>
+          <w:tcPr>
+            <w:tcW w:w="652" w:type="dxa"/>
+            <w:tcBorders>
+              <w:left w:val="single" w:sz="8" w:space="0" w:color="000000"/>
+              <w:bottom w:val="single" w:sz="8" w:space="0" w:color="000000"/>
+              <w:right w:val="single" w:sz="8" w:space="0" w:color="000000"/>
+            </w:tcBorders>
+            <w:vAlign w:val="center"/>
+          </w:tcPr>
+          <w:p>
+            <w:pPr>
+              <w:pStyle w:val="Contedodatabela"/>
+              <w:widowControl/>
+              <w:spacing w:lineRule="auto" w:line="288" w:before="0" w:after="0"/>
+              <w:jc w:val="center"/>
+              <w:rPr>
+                <w:rFonts w:ascii="Arial" w:hAnsi="Arial"/>
+              </w:rPr>
+            </w:pPr>
+            <w:r>
+              <w:rPr>
+                <w:rFonts w:cs="CenturyGothic,Bold"/>
+                <w:bCs/>
+                <w:color w:val="FF0000"/>
+                <w:sz w:val="20"/>
+                <w:szCs w:val="16"/>
+              </w:rPr>
+              <w:t xml:space="preserve">{{ </w:t>
+            </w:r>
+            <w:r>
+              <w:rPr>
+                <w:rFonts w:cs="CenturyGothic,Bold"/>
+                <w:bCs/>
+                <w:color w:val="FF0000"/>
+                <w:sz w:val="16"/>
+                <w:szCs w:val="16"/>
+              </w:rPr>
+              <w:t>item.</w:t>
+            </w:r>
+            <w:r>
+              <w:rPr>
+                <w:rFonts w:cs="CenturyGothic,Bold"/>
+                <w:bCs/>
+                <w:color w:val="FF0000"/>
+                <w:sz w:val="20"/>
+                <w:szCs w:val="16"/>
+              </w:rPr>
+              <w:t>numero_ordem }}</w:t>
+            </w:r>
+          </w:p>
+        </w:tc>
+        <w:tc>
+          <w:tcPr>
+            <w:tcW w:w="666" w:type="dxa"/>
+            <w:tcBorders>
+              <w:left w:val="single" w:sz="8" w:space="0" w:color="000000"/>
+              <w:bottom w:val="single" w:sz="8" w:space="0" w:color="000000"/>
+              <w:right w:val="single" w:sz="8" w:space="0" w:color="000000"/>
+            </w:tcBorders>
+            <w:vAlign w:val="center"/>
+          </w:tcPr>
+          <w:p>
+            <w:pPr>
+              <w:pStyle w:val="Normal"/>
+              <w:spacing w:lineRule="auto" w:line="240" w:before="0" w:after="0"/>
+              <w:rPr>
+                <w:rFonts w:ascii="Arial" w:hAnsi="Arial" w:cs="CenturyGothic,Bold"/>
+                <w:b w:val="false"/>
+                <w:bCs w:val="false"/>
+                <w:sz w:val="16"/>
+                <w:szCs w:val="16"/>
+              </w:rPr>
+            </w:pPr>
+            <w:r>
+              <w:rPr>
+                <w:rFonts w:cs="CenturyGothic,Bold"/>
+                <w:b w:val="false"/>
+                <w:bCs w:val="false"/>
+                <w:color w:val="FF0000"/>
+                <w:sz w:val="20"/>
+                <w:szCs w:val="16"/>
+              </w:rPr>
+              <w:t xml:space="preserve">{{ </w:t>
+            </w:r>
+            <w:r>
+              <w:rPr>
+                <w:rFonts w:cs="CenturyGothic,Bold"/>
+                <w:b w:val="false"/>
+                <w:bCs/>
+                <w:color w:val="FF0000"/>
+                <w:sz w:val="16"/>
+                <w:szCs w:val="16"/>
+              </w:rPr>
+              <w:t>item.</w:t>
+            </w:r>
+            <w:r>
+              <w:rPr>
+                <w:rFonts w:cs="CenturyGothic,Bold"/>
+                <w:b w:val="false"/>
+                <w:bCs w:val="false"/>
+                <w:color w:val="FF0000"/>
+                <w:sz w:val="20"/>
+                <w:szCs w:val="16"/>
+              </w:rPr>
+              <w:t>quantidade }}</w:t>
+            </w:r>
+          </w:p>
+        </w:tc>
+        <w:tc>
+          <w:tcPr>
+            <w:tcW w:w="1316" w:type="dxa"/>
+            <w:tcBorders>
+              <w:left w:val="single" w:sz="8" w:space="0" w:color="000000"/>
+              <w:bottom w:val="single" w:sz="8" w:space="0" w:color="000000"/>
+              <w:right w:val="single" w:sz="8" w:space="0" w:color="000000"/>
+            </w:tcBorders>
+            <w:vAlign w:val="center"/>
+          </w:tcPr>
+          <w:p>
+            <w:pPr>
+              <w:pStyle w:val="Contedodatabela"/>
+              <w:widowControl/>
+              <w:spacing w:lineRule="auto" w:line="288" w:before="0" w:after="0"/>
+              <w:jc w:val="center"/>
+              <w:rPr>
+                <w:rFonts w:ascii="Arial" w:hAnsi="Arial"/>
+              </w:rPr>
+            </w:pPr>
+            <w:r>
+              <w:rPr>
+                <w:rFonts w:cs="CenturyGothic,Bold"/>
+                <w:bCs/>
+                <w:color w:val="FF0000"/>
+                <w:sz w:val="20"/>
+                <w:szCs w:val="16"/>
+              </w:rPr>
+              <w:t xml:space="preserve">{{ </w:t>
+            </w:r>
+            <w:r>
+              <w:rPr>
+                <w:rFonts w:cs="CenturyGothic,Bold"/>
+                <w:bCs/>
+                <w:color w:val="FF0000"/>
+                <w:sz w:val="16"/>
+                <w:szCs w:val="16"/>
+              </w:rPr>
+              <w:t>item.</w:t>
+            </w:r>
+            <w:r>
+              <w:rPr>
+                <w:rFonts w:cs="CenturyGothic,Bold"/>
+                <w:bCs/>
+                <w:color w:val="FF0000"/>
+                <w:sz w:val="20"/>
+                <w:szCs w:val="16"/>
+              </w:rPr>
+              <w:t>codigo_comprasgov }}</w:t>
+            </w:r>
+          </w:p>
+        </w:tc>
+        <w:tc>
+          <w:tcPr>
+            <w:tcW w:w="3254" w:type="dxa"/>
+            <w:tcBorders>
+              <w:left w:val="single" w:sz="8" w:space="0" w:color="000000"/>
+              <w:bottom w:val="single" w:sz="8" w:space="0" w:color="000000"/>
+              <w:right w:val="single" w:sz="8" w:space="0" w:color="000000"/>
+            </w:tcBorders>
+            <w:shd w:color="auto" w:fill="FFFFFF" w:val="clear"/>
+            <w:vAlign w:val="center"/>
+          </w:tcPr>
+          <w:p>
+            <w:pPr>
+              <w:pStyle w:val="Contedodatabela"/>
+              <w:widowControl/>
+              <w:spacing w:lineRule="auto" w:line="288" w:before="0" w:after="0"/>
+              <w:rPr>
+                <w:rFonts w:ascii="Arial" w:hAnsi="Arial"/>
+              </w:rPr>
+            </w:pPr>
+            <w:r>
+              <w:rPr>
+                <w:rFonts w:cs="CenturyGothic,Bold"/>
+                <w:bCs/>
+                <w:color w:val="FF0000"/>
+                <w:sz w:val="16"/>
+                <w:szCs w:val="16"/>
+              </w:rPr>
+              <w:t xml:space="preserve"> </w:t>
+            </w:r>
+            <w:r>
+              <w:rPr>
+                <w:rFonts w:cs="CenturyGothic,Bold"/>
+                <w:bCs/>
+                <w:color w:val="FF0000"/>
+                <w:sz w:val="16"/>
+                <w:szCs w:val="16"/>
+              </w:rPr>
+              <w:t xml:space="preserve">{{ </w:t>
+            </w:r>
+            <w:r>
+              <w:rPr>
+                <w:rFonts w:cs="CenturyGothic,Bold"/>
+                <w:bCs/>
+                <w:color w:val="FF0000"/>
+                <w:sz w:val="16"/>
+                <w:szCs w:val="16"/>
+              </w:rPr>
+              <w:t>item.</w:t>
+            </w:r>
+            <w:r>
+              <w:rPr>
+                <w:rFonts w:cs="CenturyGothic,Bold"/>
+                <w:bCs/>
+                <w:color w:val="FF0000"/>
+                <w:sz w:val="16"/>
+                <w:szCs w:val="16"/>
+              </w:rPr>
+              <w:t>descricao }}</w:t>
+            </w:r>
+          </w:p>
+        </w:tc>
+        <w:tc>
+          <w:tcPr>
+            <w:tcW w:w="1972" w:type="dxa"/>
+            <w:tcBorders>
+              <w:left w:val="single" w:sz="8" w:space="0" w:color="000000"/>
+              <w:bottom w:val="single" w:sz="8" w:space="0" w:color="000000"/>
+              <w:right w:val="single" w:sz="8" w:space="0" w:color="000000"/>
+            </w:tcBorders>
+            <w:shd w:color="auto" w:fill="FFFFFF" w:val="clear"/>
+            <w:vAlign w:val="center"/>
+          </w:tcPr>
+          <w:p>
+            <w:pPr>
+              <w:pStyle w:val="Contedodatabela"/>
+              <w:widowControl/>
+              <w:spacing w:lineRule="auto" w:line="288" w:before="0" w:after="0"/>
+              <w:rPr>
+                <w:rFonts w:ascii="Arial" w:hAnsi="Arial"/>
+              </w:rPr>
+            </w:pPr>
+            <w:r>
+              <w:rPr>
+                <w:rFonts w:cs="CenturyGothic,Bold"/>
+                <w:bCs/>
+                <w:color w:val="FF0000"/>
+                <w:sz w:val="20"/>
+                <w:szCs w:val="16"/>
+              </w:rPr>
+              <w:t xml:space="preserve">{{ </w:t>
+            </w:r>
+            <w:r>
+              <w:rPr>
+                <w:rFonts w:cs="CenturyGothic,Bold"/>
+                <w:bCs/>
+                <w:color w:val="FF0000"/>
+                <w:sz w:val="16"/>
+                <w:szCs w:val="16"/>
+              </w:rPr>
+              <w:t>item.</w:t>
+            </w:r>
+            <w:r>
+              <w:rPr>
+                <w:rFonts w:cs="CenturyGothic,Bold"/>
+                <w:bCs/>
+                <w:color w:val="FF0000"/>
+                <w:sz w:val="20"/>
+                <w:szCs w:val="16"/>
+              </w:rPr>
+              <w:t>item_despesa }}</w:t>
+            </w:r>
+          </w:p>
+        </w:tc>
+        <w:tc>
+          <w:tcPr>
+            <w:tcW w:w="560" w:type="dxa"/>
+            <w:tcBorders>
+              <w:left w:val="single" w:sz="8" w:space="0" w:color="000000"/>
+              <w:bottom w:val="single" w:sz="8" w:space="0" w:color="000000"/>
+              <w:right w:val="single" w:sz="8" w:space="0" w:color="000000"/>
+            </w:tcBorders>
+            <w:vAlign w:val="center"/>
+          </w:tcPr>
+          <w:p>
+            <w:pPr>
+              <w:pStyle w:val="Contedodatabela"/>
+              <w:spacing w:before="0" w:after="200"/>
+              <w:rPr>
+                <w:rFonts w:ascii="Arial" w:hAnsi="Arial"/>
+              </w:rPr>
+            </w:pPr>
+            <w:r>
+              <w:rPr/>
+            </w:r>
+          </w:p>
+        </w:tc>
+        <w:tc>
+          <w:tcPr>
+            <w:tcW w:w="240" w:type="dxa"/>
+            <w:tcBorders>
+              <w:left w:val="single" w:sz="8" w:space="0" w:color="000000"/>
+              <w:bottom w:val="single" w:sz="8" w:space="0" w:color="000000"/>
+              <w:right w:val="single" w:sz="8" w:space="0" w:color="000000"/>
+            </w:tcBorders>
+            <w:vAlign w:val="center"/>
+          </w:tcPr>
+          <w:p>
+            <w:pPr>
+              <w:pStyle w:val="Contedodatabela"/>
+              <w:widowControl/>
+              <w:spacing w:lineRule="auto" w:line="288" w:before="0" w:after="0"/>
+              <w:rPr>
+                <w:rFonts w:ascii="Arial" w:hAnsi="Arial" w:cs="CenturyGothic,Bold"/>
+                <w:bCs/>
+                <w:color w:val="000000"/>
+                <w:sz w:val="20"/>
+                <w:szCs w:val="16"/>
+              </w:rPr>
+            </w:pPr>
+            <w:r>
+              <w:rPr>
+                <w:rFonts w:cs="CenturyGothic,Bold"/>
+                <w:bCs/>
+                <w:color w:val="000000"/>
+                <w:sz w:val="20"/>
+                <w:szCs w:val="16"/>
+              </w:rPr>
+            </w:r>
+          </w:p>
+        </w:tc>
+      </w:tr>
+      <w:tr>
+        <w:trPr/>
+        <w:tc>
+          <w:tcPr>
+            <w:tcW w:w="11068" w:type="dxa"/>
+            <w:gridSpan w:val="9"/>
+            <w:tcBorders>
+              <w:left w:val="single" w:sz="8" w:space="0" w:color="000000"/>
+              <w:bottom w:val="single" w:sz="8" w:space="0" w:color="000000"/>
+              <w:right w:val="single" w:sz="8" w:space="0" w:color="000000"/>
+            </w:tcBorders>
+            <w:vAlign w:val="center"/>
+          </w:tcPr>
+          <w:p>
+            <w:pPr>
+              <w:pStyle w:val="TableContents"/>
+              <w:spacing w:before="0" w:after="200"/>
+              <w:rPr>
+                <w:rFonts w:ascii="Arial" w:hAnsi="Arial"/>
+              </w:rPr>
+            </w:pPr>
+            <w:r>
+              <w:rPr>
+                <w:color w:val="2A6099"/>
+                <w:sz w:val="12"/>
+                <w:szCs w:val="12"/>
+              </w:rPr>
+              <w:t>{%tr endfor %}</w:t>
+            </w:r>
+          </w:p>
+        </w:tc>
+      </w:tr>
+    </w:tbl>
     <w:p>
       <w:pPr>
-        <w:pStyle w:val="BodyText"/>
-        <w:spacing w:lineRule="auto" w:line="240"/>
+        <w:pStyle w:val="Normal"/>
+        <w:spacing w:lineRule="auto" w:line="240" w:before="0" w:after="0"/>
         <w:rPr>
           <w:rFonts w:ascii="CenturyGothic,Bold" w:hAnsi="CenturyGothic,Bold" w:cs="CenturyGothic,Bold"/>
           <w:b/>
@@ -14008,950 +14876,6 @@
         </w:rPr>
       </w:r>
     </w:p>
-    <w:p>
-      <w:pPr>
-        <w:pStyle w:val="BodyText"/>
-        <w:spacing w:lineRule="auto" w:line="240"/>
-        <w:rPr>
-          <w:rFonts w:ascii="CenturyGothic,Bold" w:hAnsi="CenturyGothic,Bold" w:cs="CenturyGothic,Bold"/>
-          <w:b/>
-          <w:bCs/>
-          <w:sz w:val="16"/>
-          <w:szCs w:val="16"/>
-        </w:rPr>
-      </w:pPr>
-      <w:r>
-        <w:rPr>
-          <w:rFonts w:cs="CenturyGothic,Bold" w:ascii="CenturyGothic,Bold" w:hAnsi="CenturyGothic,Bold"/>
-          <w:b/>
-          <w:bCs/>
-          <w:sz w:val="16"/>
-          <w:szCs w:val="16"/>
-        </w:rPr>
-      </w:r>
-    </w:p>
-    <w:p>
-      <w:pPr>
-        <w:pStyle w:val="BodyText"/>
-        <w:spacing w:lineRule="auto" w:line="240"/>
-        <w:rPr>
-          <w:rFonts w:ascii="CenturyGothic,Bold" w:hAnsi="CenturyGothic,Bold" w:cs="CenturyGothic,Bold"/>
-          <w:b/>
-          <w:bCs/>
-          <w:sz w:val="16"/>
-          <w:szCs w:val="16"/>
-        </w:rPr>
-      </w:pPr>
-      <w:r>
-        <w:rPr>
-          <w:rFonts w:cs="CenturyGothic,Bold" w:ascii="CenturyGothic,Bold" w:hAnsi="CenturyGothic,Bold"/>
-          <w:b/>
-          <w:bCs/>
-          <w:sz w:val="16"/>
-          <w:szCs w:val="16"/>
-        </w:rPr>
-      </w:r>
-    </w:p>
-    <w:p>
-      <w:pPr>
-        <w:pStyle w:val="BodyText"/>
-        <w:spacing w:lineRule="auto" w:line="240"/>
-        <w:rPr>
-          <w:rFonts w:ascii="CenturyGothic,Bold" w:hAnsi="CenturyGothic,Bold" w:cs="CenturyGothic,Bold"/>
-          <w:b/>
-          <w:bCs/>
-          <w:sz w:val="16"/>
-          <w:szCs w:val="16"/>
-        </w:rPr>
-      </w:pPr>
-      <w:r>
-        <w:rPr>
-          <w:rFonts w:cs="CenturyGothic,Bold" w:ascii="CenturyGothic,Bold" w:hAnsi="CenturyGothic,Bold"/>
-          <w:b/>
-          <w:bCs/>
-          <w:sz w:val="16"/>
-          <w:szCs w:val="16"/>
-        </w:rPr>
-      </w:r>
-    </w:p>
-    <w:p>
-      <w:pPr>
-        <w:pStyle w:val="BodyText"/>
-        <w:spacing w:lineRule="auto" w:line="240"/>
-        <w:rPr>
-          <w:rFonts w:ascii="CenturyGothic,Bold" w:hAnsi="CenturyGothic,Bold" w:cs="CenturyGothic,Bold"/>
-          <w:b/>
-          <w:bCs/>
-          <w:sz w:val="16"/>
-          <w:szCs w:val="16"/>
-        </w:rPr>
-      </w:pPr>
-      <w:r>
-        <w:rPr>
-          <w:rFonts w:cs="CenturyGothic,Bold" w:ascii="CenturyGothic,Bold" w:hAnsi="CenturyGothic,Bold"/>
-          <w:b/>
-          <w:bCs/>
-          <w:sz w:val="16"/>
-          <w:szCs w:val="16"/>
-        </w:rPr>
-      </w:r>
-    </w:p>
-    <w:p>
-      <w:pPr>
-        <w:pStyle w:val="BodyText"/>
-        <w:spacing w:lineRule="auto" w:line="240"/>
-        <w:rPr>
-          <w:rFonts w:ascii="CenturyGothic,Bold" w:hAnsi="CenturyGothic,Bold" w:cs="CenturyGothic,Bold"/>
-          <w:b/>
-          <w:bCs/>
-          <w:sz w:val="16"/>
-          <w:szCs w:val="16"/>
-        </w:rPr>
-      </w:pPr>
-      <w:r>
-        <w:rPr>
-          <w:rFonts w:cs="CenturyGothic,Bold" w:ascii="CenturyGothic,Bold" w:hAnsi="CenturyGothic,Bold"/>
-          <w:b/>
-          <w:bCs/>
-          <w:sz w:val="16"/>
-          <w:szCs w:val="16"/>
-        </w:rPr>
-      </w:r>
-    </w:p>
-    <w:p>
-      <w:pPr>
-        <w:pStyle w:val="BodyText"/>
-        <w:spacing w:lineRule="auto" w:line="240"/>
-        <w:rPr>
-          <w:rFonts w:ascii="CenturyGothic,Bold" w:hAnsi="CenturyGothic,Bold" w:cs="CenturyGothic,Bold"/>
-          <w:b/>
-          <w:bCs/>
-          <w:sz w:val="16"/>
-          <w:szCs w:val="16"/>
-        </w:rPr>
-      </w:pPr>
-      <w:r>
-        <w:rPr>
-          <w:rFonts w:cs="CenturyGothic,Bold" w:ascii="CenturyGothic,Bold" w:hAnsi="CenturyGothic,Bold"/>
-          <w:b/>
-          <w:bCs/>
-          <w:sz w:val="16"/>
-          <w:szCs w:val="16"/>
-        </w:rPr>
-      </w:r>
-    </w:p>
-    <w:p>
-      <w:pPr>
-        <w:pStyle w:val="BodyText"/>
-        <w:spacing w:lineRule="auto" w:line="240"/>
-        <w:rPr>
-          <w:rFonts w:ascii="CenturyGothic,Bold" w:hAnsi="CenturyGothic,Bold" w:cs="CenturyGothic,Bold"/>
-          <w:b/>
-          <w:bCs/>
-          <w:sz w:val="16"/>
-          <w:szCs w:val="16"/>
-        </w:rPr>
-      </w:pPr>
-      <w:r>
-        <w:rPr>
-          <w:rFonts w:cs="CenturyGothic,Bold" w:ascii="CenturyGothic,Bold" w:hAnsi="CenturyGothic,Bold"/>
-          <w:b/>
-          <w:bCs/>
-          <w:sz w:val="16"/>
-          <w:szCs w:val="16"/>
-        </w:rPr>
-      </w:r>
-    </w:p>
-    <w:p>
-      <w:pPr>
-        <w:pStyle w:val="BodyText"/>
-        <w:spacing w:lineRule="auto" w:line="240"/>
-        <w:rPr>
-          <w:rFonts w:ascii="CenturyGothic,Bold" w:hAnsi="CenturyGothic,Bold" w:cs="CenturyGothic,Bold"/>
-          <w:b/>
-          <w:bCs/>
-          <w:sz w:val="16"/>
-          <w:szCs w:val="16"/>
-        </w:rPr>
-      </w:pPr>
-      <w:r>
-        <w:rPr>
-          <w:rFonts w:cs="CenturyGothic,Bold" w:ascii="CenturyGothic,Bold" w:hAnsi="CenturyGothic,Bold"/>
-          <w:b/>
-          <w:bCs/>
-          <w:sz w:val="16"/>
-          <w:szCs w:val="16"/>
-        </w:rPr>
-      </w:r>
-    </w:p>
-    <w:p>
-      <w:pPr>
-        <w:pStyle w:val="BodyText"/>
-        <w:spacing w:lineRule="auto" w:line="240"/>
-        <w:rPr>
-          <w:rFonts w:ascii="CenturyGothic,Bold" w:hAnsi="CenturyGothic,Bold" w:cs="CenturyGothic,Bold"/>
-          <w:b/>
-          <w:bCs/>
-          <w:sz w:val="16"/>
-          <w:szCs w:val="16"/>
-        </w:rPr>
-      </w:pPr>
-      <w:r>
-        <w:rPr>
-          <w:rFonts w:cs="CenturyGothic,Bold" w:ascii="CenturyGothic,Bold" w:hAnsi="CenturyGothic,Bold"/>
-          <w:b/>
-          <w:bCs/>
-          <w:sz w:val="16"/>
-          <w:szCs w:val="16"/>
-        </w:rPr>
-      </w:r>
-    </w:p>
-    <w:p>
-      <w:pPr>
-        <w:pStyle w:val="BodyText"/>
-        <w:spacing w:lineRule="auto" w:line="240"/>
-        <w:rPr>
-          <w:rFonts w:ascii="CenturyGothic,Bold" w:hAnsi="CenturyGothic,Bold" w:cs="CenturyGothic,Bold"/>
-          <w:b/>
-          <w:bCs/>
-          <w:sz w:val="16"/>
-          <w:szCs w:val="16"/>
-        </w:rPr>
-      </w:pPr>
-      <w:r>
-        <w:rPr>
-          <w:rFonts w:cs="CenturyGothic,Bold" w:ascii="CenturyGothic,Bold" w:hAnsi="CenturyGothic,Bold"/>
-          <w:b/>
-          <w:bCs/>
-          <w:sz w:val="16"/>
-          <w:szCs w:val="16"/>
-        </w:rPr>
-      </w:r>
-    </w:p>
-    <w:p>
-      <w:pPr>
-        <w:pStyle w:val="BodyText"/>
-        <w:spacing w:lineRule="auto" w:line="240"/>
-        <w:rPr>
-          <w:rFonts w:ascii="CenturyGothic,Bold" w:hAnsi="CenturyGothic,Bold" w:cs="CenturyGothic,Bold"/>
-          <w:b/>
-          <w:bCs/>
-          <w:sz w:val="16"/>
-          <w:szCs w:val="16"/>
-        </w:rPr>
-      </w:pPr>
-      <w:r>
-        <w:rPr>
-          <w:rFonts w:cs="CenturyGothic,Bold" w:ascii="CenturyGothic,Bold" w:hAnsi="CenturyGothic,Bold"/>
-          <w:b/>
-          <w:bCs/>
-          <w:sz w:val="16"/>
-          <w:szCs w:val="16"/>
-        </w:rPr>
-        <w:br/>
-      </w:r>
-    </w:p>
-    <w:tbl>
-      <w:tblPr>
-        <w:tblW w:w="11070" w:type="dxa"/>
-        <w:jc w:val="left"/>
-        <w:tblInd w:w="100" w:type="dxa"/>
-        <w:tblLayout w:type="fixed"/>
-        <w:tblCellMar>
-          <w:top w:w="100" w:type="dxa"/>
-          <w:left w:w="100" w:type="dxa"/>
-          <w:bottom w:w="100" w:type="dxa"/>
-          <w:right w:w="100" w:type="dxa"/>
-        </w:tblCellMar>
-        <w:tblLook w:val="04a0" w:noHBand="0" w:noVBand="1" w:firstColumn="1" w:lastRow="0" w:lastColumn="0" w:firstRow="1"/>
-      </w:tblPr>
-      <w:tblGrid>
-        <w:gridCol w:w="1109"/>
-        <w:gridCol w:w="1299"/>
-        <w:gridCol w:w="652"/>
-        <w:gridCol w:w="666"/>
-        <w:gridCol w:w="1316"/>
-        <w:gridCol w:w="3254"/>
-        <w:gridCol w:w="1959"/>
-        <w:gridCol w:w="557"/>
-        <w:gridCol w:w="256"/>
-      </w:tblGrid>
-      <w:tr>
-        <w:trPr/>
-        <w:tc>
-          <w:tcPr>
-            <w:tcW w:w="1109" w:type="dxa"/>
-            <w:tcBorders>
-              <w:top w:val="single" w:sz="8" w:space="0" w:color="000000"/>
-              <w:left w:val="single" w:sz="8" w:space="0" w:color="000000"/>
-              <w:bottom w:val="single" w:sz="8" w:space="0" w:color="000000"/>
-              <w:right w:val="single" w:sz="8" w:space="0" w:color="000000"/>
-            </w:tcBorders>
-            <w:vAlign w:val="center"/>
-          </w:tcPr>
-          <w:p>
-            <w:pPr>
-              <w:pStyle w:val="Contedodatabela"/>
-              <w:widowControl/>
-              <w:spacing w:lineRule="auto" w:line="288" w:before="0" w:after="0"/>
-              <w:rPr>
-                <w:rFonts w:ascii="Arial;sans-serif" w:hAnsi="Arial;sans-serif" w:cs="CenturyGothic,Bold"/>
-                <w:b/>
-                <w:bCs/>
-                <w:color w:val="000000"/>
-                <w:sz w:val="18"/>
-                <w:szCs w:val="16"/>
-              </w:rPr>
-            </w:pPr>
-            <w:r>
-              <w:rPr>
-                <w:rFonts w:cs="CenturyGothic,Bold" w:ascii="Arial;sans-serif" w:hAnsi="Arial;sans-serif"/>
-                <w:b/>
-                <w:bCs/>
-                <w:color w:val="000000"/>
-                <w:sz w:val="18"/>
-                <w:szCs w:val="16"/>
-              </w:rPr>
-              <w:t>Demanda</w:t>
-            </w:r>
-          </w:p>
-        </w:tc>
-        <w:tc>
-          <w:tcPr>
-            <w:tcW w:w="1299" w:type="dxa"/>
-            <w:tcBorders>
-              <w:top w:val="single" w:sz="8" w:space="0" w:color="000000"/>
-              <w:left w:val="single" w:sz="8" w:space="0" w:color="000000"/>
-              <w:bottom w:val="single" w:sz="8" w:space="0" w:color="000000"/>
-              <w:right w:val="single" w:sz="8" w:space="0" w:color="000000"/>
-            </w:tcBorders>
-            <w:vAlign w:val="center"/>
-          </w:tcPr>
-          <w:p>
-            <w:pPr>
-              <w:pStyle w:val="Contedodatabela"/>
-              <w:widowControl/>
-              <w:spacing w:lineRule="auto" w:line="288" w:before="0" w:after="0"/>
-              <w:rPr>
-                <w:rFonts w:ascii="Arial;sans-serif" w:hAnsi="Arial;sans-serif" w:cs="CenturyGothic,Bold"/>
-                <w:b/>
-                <w:bCs/>
-                <w:color w:val="000000"/>
-                <w:sz w:val="18"/>
-                <w:szCs w:val="16"/>
-              </w:rPr>
-            </w:pPr>
-            <w:r>
-              <w:rPr>
-                <w:rFonts w:cs="CenturyGothic,Bold" w:ascii="Arial;sans-serif" w:hAnsi="Arial;sans-serif"/>
-                <w:b/>
-                <w:bCs/>
-                <w:color w:val="000000"/>
-                <w:sz w:val="18"/>
-                <w:szCs w:val="16"/>
-              </w:rPr>
-              <w:t>Centro de despesa</w:t>
-            </w:r>
-          </w:p>
-        </w:tc>
-        <w:tc>
-          <w:tcPr>
-            <w:tcW w:w="652" w:type="dxa"/>
-            <w:tcBorders>
-              <w:top w:val="single" w:sz="8" w:space="0" w:color="000000"/>
-              <w:left w:val="single" w:sz="8" w:space="0" w:color="000000"/>
-              <w:bottom w:val="single" w:sz="8" w:space="0" w:color="000000"/>
-              <w:right w:val="single" w:sz="8" w:space="0" w:color="000000"/>
-            </w:tcBorders>
-            <w:vAlign w:val="center"/>
-          </w:tcPr>
-          <w:p>
-            <w:pPr>
-              <w:pStyle w:val="Contedodatabela"/>
-              <w:widowControl/>
-              <w:spacing w:lineRule="auto" w:line="288" w:before="0" w:after="0"/>
-              <w:jc w:val="center"/>
-              <w:rPr>
-                <w:rFonts w:ascii="Arial;sans-serif" w:hAnsi="Arial;sans-serif" w:cs="CenturyGothic,Bold"/>
-                <w:b/>
-                <w:bCs/>
-                <w:color w:val="000000"/>
-                <w:sz w:val="18"/>
-                <w:szCs w:val="16"/>
-              </w:rPr>
-            </w:pPr>
-            <w:r>
-              <w:rPr>
-                <w:rFonts w:cs="CenturyGothic,Bold" w:ascii="Arial;sans-serif" w:hAnsi="Arial;sans-serif"/>
-                <w:b/>
-                <w:bCs/>
-                <w:color w:val="000000"/>
-                <w:sz w:val="18"/>
-                <w:szCs w:val="16"/>
-              </w:rPr>
-              <w:t>Item</w:t>
-            </w:r>
-          </w:p>
-        </w:tc>
-        <w:tc>
-          <w:tcPr>
-            <w:tcW w:w="666" w:type="dxa"/>
-            <w:tcBorders>
-              <w:top w:val="single" w:sz="8" w:space="0" w:color="000000"/>
-              <w:left w:val="single" w:sz="8" w:space="0" w:color="000000"/>
-              <w:bottom w:val="single" w:sz="8" w:space="0" w:color="000000"/>
-              <w:right w:val="single" w:sz="8" w:space="0" w:color="000000"/>
-            </w:tcBorders>
-            <w:vAlign w:val="center"/>
-          </w:tcPr>
-          <w:p>
-            <w:pPr>
-              <w:pStyle w:val="Contedodatabela"/>
-              <w:widowControl/>
-              <w:spacing w:lineRule="auto" w:line="288" w:before="0" w:after="0"/>
-              <w:jc w:val="center"/>
-              <w:rPr>
-                <w:rFonts w:ascii="Arial;sans-serif" w:hAnsi="Arial;sans-serif" w:cs="CenturyGothic,Bold"/>
-                <w:b/>
-                <w:bCs/>
-                <w:color w:val="000000"/>
-                <w:sz w:val="18"/>
-                <w:szCs w:val="16"/>
-              </w:rPr>
-            </w:pPr>
-            <w:r>
-              <w:rPr>
-                <w:rFonts w:cs="CenturyGothic,Bold" w:ascii="Arial;sans-serif" w:hAnsi="Arial;sans-serif"/>
-                <w:b/>
-                <w:bCs/>
-                <w:color w:val="000000"/>
-                <w:sz w:val="18"/>
-                <w:szCs w:val="16"/>
-              </w:rPr>
-              <w:t>Qtde</w:t>
-            </w:r>
-          </w:p>
-        </w:tc>
-        <w:tc>
-          <w:tcPr>
-            <w:tcW w:w="1316" w:type="dxa"/>
-            <w:tcBorders>
-              <w:top w:val="single" w:sz="8" w:space="0" w:color="000000"/>
-              <w:left w:val="single" w:sz="8" w:space="0" w:color="000000"/>
-              <w:bottom w:val="single" w:sz="8" w:space="0" w:color="000000"/>
-              <w:right w:val="single" w:sz="8" w:space="0" w:color="000000"/>
-            </w:tcBorders>
-            <w:vAlign w:val="center"/>
-          </w:tcPr>
-          <w:p>
-            <w:pPr>
-              <w:pStyle w:val="Contedodatabela"/>
-              <w:widowControl/>
-              <w:spacing w:lineRule="auto" w:line="288" w:before="0" w:after="0"/>
-              <w:jc w:val="center"/>
-              <w:rPr>
-                <w:rFonts w:ascii="Arial;sans-serif" w:hAnsi="Arial;sans-serif" w:cs="CenturyGothic,Bold"/>
-                <w:b/>
-                <w:bCs/>
-                <w:color w:val="000000"/>
-                <w:sz w:val="18"/>
-                <w:szCs w:val="16"/>
-              </w:rPr>
-            </w:pPr>
-            <w:r>
-              <w:rPr>
-                <w:rFonts w:cs="CenturyGothic,Bold" w:ascii="Arial;sans-serif" w:hAnsi="Arial;sans-serif"/>
-                <w:b/>
-                <w:bCs/>
-                <w:color w:val="000000"/>
-                <w:sz w:val="18"/>
-                <w:szCs w:val="16"/>
-              </w:rPr>
-              <w:t>Código Compras GOV</w:t>
-            </w:r>
-          </w:p>
-        </w:tc>
-        <w:tc>
-          <w:tcPr>
-            <w:tcW w:w="3254" w:type="dxa"/>
-            <w:tcBorders>
-              <w:top w:val="single" w:sz="8" w:space="0" w:color="000000"/>
-              <w:left w:val="single" w:sz="8" w:space="0" w:color="000000"/>
-              <w:bottom w:val="single" w:sz="8" w:space="0" w:color="000000"/>
-              <w:right w:val="single" w:sz="8" w:space="0" w:color="000000"/>
-            </w:tcBorders>
-            <w:vAlign w:val="center"/>
-          </w:tcPr>
-          <w:p>
-            <w:pPr>
-              <w:pStyle w:val="Contedodatabela"/>
-              <w:widowControl/>
-              <w:spacing w:lineRule="auto" w:line="288" w:before="0" w:after="0"/>
-              <w:rPr>
-                <w:rFonts w:ascii="Arial;sans-serif" w:hAnsi="Arial;sans-serif" w:cs="CenturyGothic,Bold"/>
-                <w:b/>
-                <w:bCs/>
-                <w:color w:val="000000"/>
-                <w:sz w:val="18"/>
-                <w:szCs w:val="16"/>
-              </w:rPr>
-            </w:pPr>
-            <w:r>
-              <w:rPr>
-                <w:rFonts w:cs="CenturyGothic,Bold" w:ascii="Arial;sans-serif" w:hAnsi="Arial;sans-serif"/>
-                <w:b/>
-                <w:bCs/>
-                <w:color w:val="000000"/>
-                <w:sz w:val="18"/>
-                <w:szCs w:val="16"/>
-              </w:rPr>
-              <w:t>Descrição</w:t>
-            </w:r>
-          </w:p>
-        </w:tc>
-        <w:tc>
-          <w:tcPr>
-            <w:tcW w:w="1959" w:type="dxa"/>
-            <w:tcBorders>
-              <w:top w:val="single" w:sz="8" w:space="0" w:color="000000"/>
-              <w:left w:val="single" w:sz="8" w:space="0" w:color="000000"/>
-              <w:bottom w:val="single" w:sz="8" w:space="0" w:color="000000"/>
-              <w:right w:val="single" w:sz="8" w:space="0" w:color="000000"/>
-            </w:tcBorders>
-            <w:vAlign w:val="center"/>
-          </w:tcPr>
-          <w:p>
-            <w:pPr>
-              <w:pStyle w:val="Contedodatabela"/>
-              <w:widowControl/>
-              <w:spacing w:lineRule="auto" w:line="288" w:before="0" w:after="0"/>
-              <w:rPr>
-                <w:rFonts w:ascii="Arial;sans-serif" w:hAnsi="Arial;sans-serif" w:cs="CenturyGothic,Bold"/>
-                <w:b/>
-                <w:bCs/>
-                <w:color w:val="000000"/>
-                <w:sz w:val="18"/>
-                <w:szCs w:val="16"/>
-              </w:rPr>
-            </w:pPr>
-            <w:r>
-              <w:rPr>
-                <w:rFonts w:cs="CenturyGothic,Bold" w:ascii="Arial;sans-serif" w:hAnsi="Arial;sans-serif"/>
-                <w:b/>
-                <w:bCs/>
-                <w:color w:val="000000"/>
-                <w:sz w:val="18"/>
-                <w:szCs w:val="16"/>
-              </w:rPr>
-              <w:t>Item de despesa</w:t>
-            </w:r>
-          </w:p>
-        </w:tc>
-        <w:tc>
-          <w:tcPr>
-            <w:tcW w:w="557" w:type="dxa"/>
-            <w:tcBorders>
-              <w:top w:val="single" w:sz="8" w:space="0" w:color="000000"/>
-              <w:left w:val="single" w:sz="8" w:space="0" w:color="000000"/>
-              <w:bottom w:val="single" w:sz="8" w:space="0" w:color="000000"/>
-              <w:right w:val="single" w:sz="8" w:space="0" w:color="000000"/>
-            </w:tcBorders>
-            <w:vAlign w:val="center"/>
-          </w:tcPr>
-          <w:p>
-            <w:pPr>
-              <w:pStyle w:val="Contedodatabela"/>
-              <w:widowControl/>
-              <w:spacing w:lineRule="auto" w:line="288" w:before="0" w:after="0"/>
-              <w:rPr>
-                <w:rFonts w:ascii="Arial;sans-serif" w:hAnsi="Arial;sans-serif" w:cs="CenturyGothic,Bold"/>
-                <w:b/>
-                <w:bCs/>
-                <w:color w:val="000000"/>
-                <w:sz w:val="18"/>
-                <w:szCs w:val="16"/>
-              </w:rPr>
-            </w:pPr>
-            <w:r>
-              <w:rPr>
-                <w:rFonts w:cs="CenturyGothic,Bold" w:ascii="Arial;sans-serif" w:hAnsi="Arial;sans-serif"/>
-                <w:b/>
-                <w:bCs/>
-                <w:color w:val="000000"/>
-                <w:sz w:val="18"/>
-                <w:szCs w:val="16"/>
-              </w:rPr>
-              <w:t>TRP</w:t>
-            </w:r>
-          </w:p>
-        </w:tc>
-        <w:tc>
-          <w:tcPr>
-            <w:tcW w:w="256" w:type="dxa"/>
-            <w:tcBorders>
-              <w:top w:val="single" w:sz="8" w:space="0" w:color="000000"/>
-              <w:left w:val="single" w:sz="8" w:space="0" w:color="000000"/>
-              <w:bottom w:val="single" w:sz="8" w:space="0" w:color="000000"/>
-              <w:right w:val="single" w:sz="8" w:space="0" w:color="000000"/>
-            </w:tcBorders>
-            <w:vAlign w:val="center"/>
-          </w:tcPr>
-          <w:p>
-            <w:pPr>
-              <w:pStyle w:val="Contedodatabela"/>
-              <w:widowControl/>
-              <w:spacing w:lineRule="auto" w:line="288" w:before="0" w:after="0"/>
-              <w:rPr>
-                <w:rFonts w:ascii="Arial;sans-serif" w:hAnsi="Arial;sans-serif" w:cs="CenturyGothic,Bold"/>
-                <w:b/>
-                <w:bCs/>
-                <w:color w:val="000000"/>
-                <w:sz w:val="18"/>
-                <w:szCs w:val="16"/>
-              </w:rPr>
-            </w:pPr>
-            <w:r>
-              <w:rPr>
-                <w:rFonts w:cs="CenturyGothic,Bold" w:ascii="Arial;sans-serif" w:hAnsi="Arial;sans-serif"/>
-                <w:b/>
-                <w:bCs/>
-                <w:color w:val="000000"/>
-                <w:sz w:val="18"/>
-                <w:szCs w:val="16"/>
-              </w:rPr>
-              <w:t>TR</w:t>
-            </w:r>
-          </w:p>
-        </w:tc>
-      </w:tr>
-      <w:tr>
-        <w:trPr/>
-        <w:tc>
-          <w:tcPr>
-            <w:tcW w:w="1109" w:type="dxa"/>
-            <w:tcBorders>
-              <w:top w:val="single" w:sz="8" w:space="0" w:color="000000"/>
-              <w:left w:val="single" w:sz="8" w:space="0" w:color="000000"/>
-              <w:bottom w:val="single" w:sz="8" w:space="0" w:color="000000"/>
-              <w:right w:val="single" w:sz="8" w:space="0" w:color="000000"/>
-            </w:tcBorders>
-            <w:vAlign w:val="center"/>
-          </w:tcPr>
-          <w:p>
-            <w:pPr>
-              <w:pStyle w:val="Contedodatabela"/>
-              <w:widowControl/>
-              <w:spacing w:lineRule="auto" w:line="288" w:before="0" w:after="0"/>
-              <w:rPr>
-                <w:rFonts w:ascii="Arial;sans-serif" w:hAnsi="Arial;sans-serif" w:cs="CenturyGothic,Bold"/>
-                <w:bCs/>
-                <w:color w:val="000000"/>
-                <w:sz w:val="20"/>
-                <w:szCs w:val="16"/>
-              </w:rPr>
-            </w:pPr>
-            <w:r>
-              <w:rPr>
-                <w:rFonts w:cs="CenturyGothic,Bold" w:ascii="Arial;sans-serif" w:hAnsi="Arial;sans-serif"/>
-                <w:bCs/>
-                <w:color w:val="000000"/>
-                <w:sz w:val="20"/>
-                <w:szCs w:val="16"/>
-              </w:rPr>
-              <w:t>{{ numero_demanda }}</w:t>
-            </w:r>
-          </w:p>
-        </w:tc>
-        <w:tc>
-          <w:tcPr>
-            <w:tcW w:w="1299" w:type="dxa"/>
-            <w:tcBorders>
-              <w:top w:val="single" w:sz="8" w:space="0" w:color="000000"/>
-              <w:left w:val="single" w:sz="8" w:space="0" w:color="000000"/>
-              <w:bottom w:val="single" w:sz="8" w:space="0" w:color="000000"/>
-              <w:right w:val="single" w:sz="8" w:space="0" w:color="000000"/>
-            </w:tcBorders>
-            <w:vAlign w:val="center"/>
-          </w:tcPr>
-          <w:p>
-            <w:pPr>
-              <w:pStyle w:val="Contedodatabela"/>
-              <w:widowControl/>
-              <w:spacing w:lineRule="auto" w:line="288" w:before="0" w:after="0"/>
-              <w:rPr>
-                <w:rFonts w:ascii="Arial;sans-serif" w:hAnsi="Arial;sans-serif" w:cs="CenturyGothic,Bold"/>
-                <w:bCs/>
-                <w:color w:val="000000"/>
-                <w:sz w:val="16"/>
-                <w:szCs w:val="16"/>
-              </w:rPr>
-            </w:pPr>
-            <w:r>
-              <w:rPr>
-                <w:rFonts w:cs="CenturyGothic,Bold" w:ascii="Arial;sans-serif" w:hAnsi="Arial;sans-serif"/>
-                <w:bCs/>
-                <w:color w:val="000000"/>
-                <w:sz w:val="16"/>
-                <w:szCs w:val="16"/>
-              </w:rPr>
-              <w:t>{{ centro_despesa }}</w:t>
-            </w:r>
-          </w:p>
-        </w:tc>
-        <w:tc>
-          <w:tcPr>
-            <w:tcW w:w="652" w:type="dxa"/>
-            <w:tcBorders>
-              <w:top w:val="single" w:sz="8" w:space="0" w:color="000000"/>
-              <w:left w:val="single" w:sz="8" w:space="0" w:color="000000"/>
-              <w:bottom w:val="single" w:sz="8" w:space="0" w:color="000000"/>
-              <w:right w:val="single" w:sz="8" w:space="0" w:color="000000"/>
-            </w:tcBorders>
-            <w:vAlign w:val="center"/>
-          </w:tcPr>
-          <w:p>
-            <w:pPr>
-              <w:pStyle w:val="Contedodatabela"/>
-              <w:widowControl/>
-              <w:spacing w:lineRule="auto" w:line="288" w:before="0" w:after="0"/>
-              <w:jc w:val="center"/>
-              <w:rPr>
-                <w:rFonts w:ascii="Arial;sans-serif" w:hAnsi="Arial;sans-serif" w:cs="CenturyGothic,Bold"/>
-                <w:bCs/>
-                <w:color w:val="000000"/>
-                <w:sz w:val="20"/>
-                <w:szCs w:val="16"/>
-              </w:rPr>
-            </w:pPr>
-            <w:r>
-              <w:rPr>
-                <w:rFonts w:cs="CenturyGothic,Bold" w:ascii="Arial;sans-serif" w:hAnsi="Arial;sans-serif"/>
-                <w:bCs/>
-                <w:color w:val="000000"/>
-                <w:sz w:val="20"/>
-                <w:szCs w:val="16"/>
-              </w:rPr>
-              <w:t>{{ item }}</w:t>
-            </w:r>
-          </w:p>
-        </w:tc>
-        <w:tc>
-          <w:tcPr>
-            <w:tcW w:w="666" w:type="dxa"/>
-            <w:tcBorders>
-              <w:top w:val="single" w:sz="8" w:space="0" w:color="000000"/>
-              <w:left w:val="single" w:sz="8" w:space="0" w:color="000000"/>
-              <w:bottom w:val="single" w:sz="8" w:space="0" w:color="000000"/>
-              <w:right w:val="single" w:sz="8" w:space="0" w:color="000000"/>
-            </w:tcBorders>
-            <w:vAlign w:val="center"/>
-          </w:tcPr>
-          <w:p>
-            <w:pPr>
-              <w:pStyle w:val="Contedodatabela"/>
-              <w:widowControl/>
-              <w:spacing w:lineRule="auto" w:line="288" w:before="0" w:after="0"/>
-              <w:jc w:val="center"/>
-              <w:rPr>
-                <w:rFonts w:ascii="Arial;sans-serif" w:hAnsi="Arial;sans-serif" w:cs="CenturyGothic,Bold"/>
-                <w:bCs/>
-                <w:color w:val="000000"/>
-                <w:sz w:val="20"/>
-                <w:szCs w:val="16"/>
-              </w:rPr>
-            </w:pPr>
-            <w:r>
-              <w:rPr>
-                <w:rFonts w:cs="CenturyGothic,Bold" w:ascii="Arial;sans-serif" w:hAnsi="Arial;sans-serif"/>
-                <w:bCs/>
-                <w:color w:val="000000"/>
-                <w:sz w:val="20"/>
-                <w:szCs w:val="16"/>
-              </w:rPr>
-              <w:t>{{ qtde }}</w:t>
-            </w:r>
-          </w:p>
-        </w:tc>
-        <w:tc>
-          <w:tcPr>
-            <w:tcW w:w="1316" w:type="dxa"/>
-            <w:tcBorders>
-              <w:top w:val="single" w:sz="8" w:space="0" w:color="000000"/>
-              <w:left w:val="single" w:sz="8" w:space="0" w:color="000000"/>
-              <w:bottom w:val="single" w:sz="8" w:space="0" w:color="000000"/>
-              <w:right w:val="single" w:sz="8" w:space="0" w:color="000000"/>
-            </w:tcBorders>
-            <w:vAlign w:val="center"/>
-          </w:tcPr>
-          <w:p>
-            <w:pPr>
-              <w:pStyle w:val="Contedodatabela"/>
-              <w:widowControl/>
-              <w:spacing w:lineRule="auto" w:line="288" w:before="0" w:after="0"/>
-              <w:jc w:val="center"/>
-              <w:rPr>
-                <w:rFonts w:ascii="Arial;sans-serif" w:hAnsi="Arial;sans-serif" w:cs="CenturyGothic,Bold"/>
-                <w:bCs/>
-                <w:color w:val="000000"/>
-                <w:sz w:val="20"/>
-                <w:szCs w:val="16"/>
-              </w:rPr>
-            </w:pPr>
-            <w:r>
-              <w:rPr>
-                <w:rFonts w:cs="CenturyGothic,Bold" w:ascii="Arial;sans-serif" w:hAnsi="Arial;sans-serif"/>
-                <w:bCs/>
-                <w:color w:val="000000"/>
-                <w:sz w:val="20"/>
-                <w:szCs w:val="16"/>
-              </w:rPr>
-              <w:t>{{ codigo_comprasgov }}</w:t>
-            </w:r>
-          </w:p>
-        </w:tc>
-        <w:tc>
-          <w:tcPr>
-            <w:tcW w:w="3254" w:type="dxa"/>
-            <w:tcBorders>
-              <w:top w:val="single" w:sz="8" w:space="0" w:color="000000"/>
-              <w:left w:val="single" w:sz="8" w:space="0" w:color="000000"/>
-              <w:bottom w:val="single" w:sz="8" w:space="0" w:color="000000"/>
-              <w:right w:val="single" w:sz="8" w:space="0" w:color="000000"/>
-            </w:tcBorders>
-            <w:shd w:color="auto" w:fill="FFFFFF" w:val="clear"/>
-            <w:vAlign w:val="center"/>
-          </w:tcPr>
-          <w:p>
-            <w:pPr>
-              <w:pStyle w:val="Contedodatabela"/>
-              <w:widowControl/>
-              <w:spacing w:lineRule="auto" w:line="288" w:before="0" w:after="0"/>
-              <w:rPr>
-                <w:rFonts w:ascii="Arial;sans-serif" w:hAnsi="Arial;sans-serif" w:cs="CenturyGothic,Bold"/>
-                <w:bCs/>
-                <w:color w:val="000000"/>
-                <w:sz w:val="16"/>
-                <w:szCs w:val="16"/>
-              </w:rPr>
-            </w:pPr>
-            <w:r>
-              <w:rPr>
-                <w:rFonts w:cs="CenturyGothic,Bold" w:ascii="Arial;sans-serif" w:hAnsi="Arial;sans-serif"/>
-                <w:bCs/>
-                <w:color w:val="000000"/>
-                <w:sz w:val="16"/>
-                <w:szCs w:val="16"/>
-              </w:rPr>
-              <w:t xml:space="preserve"> </w:t>
-            </w:r>
-            <w:r>
-              <w:rPr>
-                <w:rFonts w:cs="CenturyGothic,Bold" w:ascii="Arial;sans-serif" w:hAnsi="Arial;sans-serif"/>
-                <w:bCs/>
-                <w:color w:val="000000"/>
-                <w:sz w:val="16"/>
-                <w:szCs w:val="16"/>
-              </w:rPr>
-              <w:t>{{ descricao }}</w:t>
-            </w:r>
-          </w:p>
-        </w:tc>
-        <w:tc>
-          <w:tcPr>
-            <w:tcW w:w="1959" w:type="dxa"/>
-            <w:tcBorders>
-              <w:top w:val="single" w:sz="8" w:space="0" w:color="000000"/>
-              <w:left w:val="single" w:sz="8" w:space="0" w:color="000000"/>
-              <w:bottom w:val="single" w:sz="8" w:space="0" w:color="000000"/>
-              <w:right w:val="single" w:sz="8" w:space="0" w:color="000000"/>
-            </w:tcBorders>
-            <w:shd w:color="auto" w:fill="FFFFFF" w:val="clear"/>
-            <w:vAlign w:val="center"/>
-          </w:tcPr>
-          <w:p>
-            <w:pPr>
-              <w:pStyle w:val="Contedodatabela"/>
-              <w:widowControl/>
-              <w:spacing w:lineRule="auto" w:line="288" w:before="0" w:after="0"/>
-              <w:rPr>
-                <w:rFonts w:ascii="Arial;sans-serif" w:hAnsi="Arial;sans-serif" w:cs="CenturyGothic,Bold"/>
-                <w:bCs/>
-                <w:color w:val="000000"/>
-                <w:sz w:val="20"/>
-                <w:szCs w:val="16"/>
-              </w:rPr>
-            </w:pPr>
-            <w:r>
-              <w:rPr>
-                <w:rFonts w:cs="CenturyGothic,Bold" w:ascii="Arial;sans-serif" w:hAnsi="Arial;sans-serif"/>
-                <w:bCs/>
-                <w:color w:val="000000"/>
-                <w:sz w:val="20"/>
-                <w:szCs w:val="16"/>
-              </w:rPr>
-              <w:t>{{ item_despesa }}</w:t>
-            </w:r>
-          </w:p>
-        </w:tc>
-        <w:tc>
-          <w:tcPr>
-            <w:tcW w:w="557" w:type="dxa"/>
-            <w:tcBorders>
-              <w:top w:val="single" w:sz="8" w:space="0" w:color="000000"/>
-              <w:left w:val="single" w:sz="8" w:space="0" w:color="000000"/>
-              <w:bottom w:val="single" w:sz="8" w:space="0" w:color="000000"/>
-              <w:right w:val="single" w:sz="8" w:space="0" w:color="000000"/>
-            </w:tcBorders>
-            <w:vAlign w:val="center"/>
-          </w:tcPr>
-          <w:p>
-            <w:pPr>
-              <w:pStyle w:val="Contedodatabela"/>
-              <w:spacing w:before="0" w:after="200"/>
-              <w:rPr/>
-            </w:pPr>
-            <w:r>
-              <w:rPr/>
-            </w:r>
-          </w:p>
-        </w:tc>
-        <w:tc>
-          <w:tcPr>
-            <w:tcW w:w="256" w:type="dxa"/>
-            <w:tcBorders>
-              <w:top w:val="single" w:sz="8" w:space="0" w:color="000000"/>
-              <w:left w:val="single" w:sz="8" w:space="0" w:color="000000"/>
-              <w:bottom w:val="single" w:sz="8" w:space="0" w:color="000000"/>
-              <w:right w:val="single" w:sz="8" w:space="0" w:color="000000"/>
-            </w:tcBorders>
-            <w:vAlign w:val="center"/>
-          </w:tcPr>
-          <w:p>
-            <w:pPr>
-              <w:pStyle w:val="Contedodatabela"/>
-              <w:widowControl/>
-              <w:spacing w:lineRule="auto" w:line="288" w:before="0" w:after="0"/>
-              <w:rPr>
-                <w:rFonts w:ascii="Arial;sans-serif" w:hAnsi="Arial;sans-serif" w:cs="CenturyGothic,Bold"/>
-                <w:bCs/>
-                <w:color w:val="000000"/>
-                <w:sz w:val="20"/>
-                <w:szCs w:val="16"/>
-              </w:rPr>
-            </w:pPr>
-            <w:r>
-              <w:rPr>
-                <w:rFonts w:cs="CenturyGothic,Bold" w:ascii="Arial;sans-serif" w:hAnsi="Arial;sans-serif"/>
-                <w:bCs/>
-                <w:color w:val="000000"/>
-                <w:sz w:val="20"/>
-                <w:szCs w:val="16"/>
-              </w:rPr>
-            </w:r>
-          </w:p>
-        </w:tc>
-      </w:tr>
-    </w:tbl>
     <w:p>
       <w:pPr>
         <w:pStyle w:val="Normal"/>
@@ -15021,7 +14945,7 @@
     <w:sectPr>
       <w:type w:val="nextPage"/>
       <w:pgSz w:w="11906" w:h="16838"/>
-      <w:pgMar w:left="284" w:right="284" w:gutter="0" w:header="0" w:top="567" w:footer="0" w:bottom="851"/>
+      <w:pgMar w:left="284" w:right="1722" w:gutter="0" w:header="0" w:top="567" w:footer="0" w:bottom="851"/>
       <w:pgNumType w:fmt="decimal"/>
       <w:formProt w:val="false"/>
       <w:textDirection w:val="lrTb"/>
@@ -15036,7 +14960,7 @@
   <w:comment w:id="0" w:author="Kleber" w:date="2024-08-14T08:02:00Z" w:initials="K">
     <w:p>
       <w:pPr>
-        <w:overflowPunct w:val="false"/>
+        <w:overflowPunct w:val="true"/>
         <w:spacing w:lineRule="auto" w:line="240" w:before="0" w:after="0"/>
         <w:rPr/>
       </w:pPr>
@@ -15054,7 +14978,7 @@
   <w:comment w:id="1" w:author="Kleber" w:date="2025-06-18T11:03:00Z" w:initials="K">
     <w:p>
       <w:pPr>
-        <w:overflowPunct w:val="false"/>
+        <w:overflowPunct w:val="true"/>
         <w:spacing w:lineRule="auto" w:line="240" w:before="0" w:after="0"/>
         <w:rPr/>
       </w:pPr>

</xml_diff>